<commit_message>
Update slides and report for --symbols and 35 checks
</commit_message>
<xml_diff>
--- a/docs/final_report.docx
+++ b/docs/final_report.docx
@@ -381,7 +381,7 @@
           <w:sz w:val="24"/>
           <w:szCs w:val="24"/>
         </w:rPr>
-        <w:t xml:space="preserve"> operation as it happens, with an optional step-by-step mode for live walkthroughs, so that the normally invisible patch lists can be watched while code is generated. Second, a two-pass baseline written as a second Bison grammar generates the same code the conventional way, through a syntax tree and symbolic labels. Both programs produce identical quadruples for all 15 code-generating test programs, which cross-checks every semantic action, and the comparison quantifies what each approach must hold in memory until jump targets are known.</w:t>
+        <w:t xml:space="preserve"> operation as it happens, with an optional step-by-step mode for live walkthroughs, so that the normally invisible patch lists can be watched while code is generated. Second, a two-pass baseline written as a second Bison grammar generates the same code the conventional way, through a syntax tree and symbolic labels. Both programs produce identical output, error messages included, on all 16 test programs run through both, which cross-checks every semantic action, and the comparison quantifies what each approach must hold in memory until jump targets are known.</w:t>
       </w:r>
     </w:p>
     <w:p>
@@ -1438,6 +1438,9 @@
             </w:tcMar>
           </w:tcPr>
           <w:p>
+            <w:pPr>
+              <w:keepNext/>
+            </w:pPr>
             <w:r>
               <w:rPr>
                 <w:rFonts w:ascii="Times New Roman" w:cs="Times New Roman" w:eastAsia="Times New Roman" w:hAnsi="Times New Roman"/>
@@ -1469,6 +1472,9 @@
             </w:tcMar>
           </w:tcPr>
           <w:p>
+            <w:pPr>
+              <w:keepNext/>
+            </w:pPr>
             <w:r>
               <w:rPr>
                 <w:rFonts w:ascii="Times New Roman" w:cs="Times New Roman" w:eastAsia="Times New Roman" w:hAnsi="Times New Roman"/>
@@ -1500,6 +1506,9 @@
             </w:tcMar>
           </w:tcPr>
           <w:p>
+            <w:pPr>
+              <w:keepNext/>
+            </w:pPr>
             <w:r>
               <w:rPr>
                 <w:rFonts w:ascii="Times New Roman" w:cs="Times New Roman" w:eastAsia="Times New Roman" w:hAnsi="Times New Roman"/>
@@ -1531,6 +1540,9 @@
             </w:tcMar>
           </w:tcPr>
           <w:p>
+            <w:pPr>
+              <w:keepNext/>
+            </w:pPr>
             <w:r>
               <w:rPr>
                 <w:rFonts w:ascii="Times New Roman" w:cs="Times New Roman" w:eastAsia="Times New Roman" w:hAnsi="Times New Roman"/>
@@ -1567,6 +1579,9 @@
             </w:tcMar>
           </w:tcPr>
           <w:p>
+            <w:pPr>
+              <w:keepNext/>
+            </w:pPr>
             <w:r>
               <w:rPr>
                 <w:rFonts w:ascii="Times New Roman" w:cs="Times New Roman" w:eastAsia="Times New Roman" w:hAnsi="Times New Roman"/>
@@ -1596,6 +1611,9 @@
             </w:tcMar>
           </w:tcPr>
           <w:p>
+            <w:pPr>
+              <w:keepNext/>
+            </w:pPr>
             <w:r>
               <w:rPr>
                 <w:rFonts w:ascii="Times New Roman" w:cs="Times New Roman" w:eastAsia="Times New Roman" w:hAnsi="Times New Roman"/>
@@ -1625,6 +1643,9 @@
             </w:tcMar>
           </w:tcPr>
           <w:p>
+            <w:pPr>
+              <w:keepNext/>
+            </w:pPr>
             <w:r>
               <w:rPr>
                 <w:rFonts w:ascii="Times New Roman" w:cs="Times New Roman" w:eastAsia="Times New Roman" w:hAnsi="Times New Roman"/>
@@ -1654,6 +1675,9 @@
             </w:tcMar>
           </w:tcPr>
           <w:p>
+            <w:pPr>
+              <w:keepNext/>
+            </w:pPr>
             <w:r>
               <w:rPr>
                 <w:rFonts w:ascii="Times New Roman" w:cs="Times New Roman" w:eastAsia="Times New Roman" w:hAnsi="Times New Roman"/>
@@ -1689,6 +1713,9 @@
             </w:tcMar>
           </w:tcPr>
           <w:p>
+            <w:pPr>
+              <w:keepNext/>
+            </w:pPr>
             <w:r>
               <w:rPr>
                 <w:rFonts w:ascii="Times New Roman" w:cs="Times New Roman" w:eastAsia="Times New Roman" w:hAnsi="Times New Roman"/>
@@ -1718,6 +1745,9 @@
             </w:tcMar>
           </w:tcPr>
           <w:p>
+            <w:pPr>
+              <w:keepNext/>
+            </w:pPr>
             <w:r>
               <w:rPr>
                 <w:rFonts w:ascii="Times New Roman" w:cs="Times New Roman" w:eastAsia="Times New Roman" w:hAnsi="Times New Roman"/>
@@ -1747,6 +1777,9 @@
             </w:tcMar>
           </w:tcPr>
           <w:p>
+            <w:pPr>
+              <w:keepNext/>
+            </w:pPr>
             <w:r>
               <w:rPr>
                 <w:rFonts w:ascii="Times New Roman" w:cs="Times New Roman" w:eastAsia="Times New Roman" w:hAnsi="Times New Roman"/>
@@ -1776,6 +1809,9 @@
             </w:tcMar>
           </w:tcPr>
           <w:p>
+            <w:pPr>
+              <w:keepNext/>
+            </w:pPr>
             <w:r>
               <w:rPr>
                 <w:rFonts w:ascii="Times New Roman" w:cs="Times New Roman" w:eastAsia="Times New Roman" w:hAnsi="Times New Roman"/>
@@ -1811,6 +1847,9 @@
             </w:tcMar>
           </w:tcPr>
           <w:p>
+            <w:pPr>
+              <w:keepNext/>
+            </w:pPr>
             <w:r>
               <w:rPr>
                 <w:rFonts w:ascii="Times New Roman" w:cs="Times New Roman" w:eastAsia="Times New Roman" w:hAnsi="Times New Roman"/>
@@ -1840,6 +1879,9 @@
             </w:tcMar>
           </w:tcPr>
           <w:p>
+            <w:pPr>
+              <w:keepNext/>
+            </w:pPr>
             <w:r>
               <w:rPr>
                 <w:rFonts w:ascii="Times New Roman" w:cs="Times New Roman" w:eastAsia="Times New Roman" w:hAnsi="Times New Roman"/>
@@ -1869,6 +1911,9 @@
             </w:tcMar>
           </w:tcPr>
           <w:p>
+            <w:pPr>
+              <w:keepNext/>
+            </w:pPr>
             <w:r>
               <w:rPr>
                 <w:rFonts w:ascii="Times New Roman" w:cs="Times New Roman" w:eastAsia="Times New Roman" w:hAnsi="Times New Roman"/>
@@ -1898,6 +1943,9 @@
             </w:tcMar>
           </w:tcPr>
           <w:p>
+            <w:pPr>
+              <w:keepNext/>
+            </w:pPr>
             <w:r>
               <w:rPr>
                 <w:rFonts w:ascii="Times New Roman" w:cs="Times New Roman" w:eastAsia="Times New Roman" w:hAnsi="Times New Roman"/>
@@ -1933,6 +1981,9 @@
             </w:tcMar>
           </w:tcPr>
           <w:p>
+            <w:pPr>
+              <w:keepNext/>
+            </w:pPr>
             <w:r>
               <w:rPr>
                 <w:rFonts w:ascii="Times New Roman" w:cs="Times New Roman" w:eastAsia="Times New Roman" w:hAnsi="Times New Roman"/>
@@ -1962,6 +2013,9 @@
             </w:tcMar>
           </w:tcPr>
           <w:p>
+            <w:pPr>
+              <w:keepNext/>
+            </w:pPr>
             <w:r>
               <w:rPr>
                 <w:rFonts w:ascii="Times New Roman" w:cs="Times New Roman" w:eastAsia="Times New Roman" w:hAnsi="Times New Roman"/>
@@ -1991,6 +2045,9 @@
             </w:tcMar>
           </w:tcPr>
           <w:p>
+            <w:pPr>
+              <w:keepNext/>
+            </w:pPr>
             <w:r>
               <w:rPr>
                 <w:rFonts w:ascii="Times New Roman" w:cs="Times New Roman" w:eastAsia="Times New Roman" w:hAnsi="Times New Roman"/>
@@ -2020,6 +2077,9 @@
             </w:tcMar>
           </w:tcPr>
           <w:p>
+            <w:pPr>
+              <w:keepNext/>
+            </w:pPr>
             <w:r>
               <w:rPr>
                 <w:rFonts w:ascii="Times New Roman" w:cs="Times New Roman" w:eastAsia="Times New Roman" w:hAnsi="Times New Roman"/>
@@ -2789,6 +2849,9 @@
             </w:tcMar>
           </w:tcPr>
           <w:p>
+            <w:pPr>
+              <w:keepNext/>
+            </w:pPr>
             <w:r>
               <w:rPr>
                 <w:rFonts w:ascii="Times New Roman" w:cs="Times New Roman" w:eastAsia="Times New Roman" w:hAnsi="Times New Roman"/>
@@ -2820,6 +2883,9 @@
             </w:tcMar>
           </w:tcPr>
           <w:p>
+            <w:pPr>
+              <w:keepNext/>
+            </w:pPr>
             <w:r>
               <w:rPr>
                 <w:rFonts w:ascii="Times New Roman" w:cs="Times New Roman" w:eastAsia="Times New Roman" w:hAnsi="Times New Roman"/>
@@ -2856,6 +2922,9 @@
             </w:tcMar>
           </w:tcPr>
           <w:p>
+            <w:pPr>
+              <w:keepNext/>
+            </w:pPr>
             <w:r>
               <w:rPr>
                 <w:rFonts w:ascii="Courier New" w:cs="Courier New" w:eastAsia="Courier New" w:hAnsi="Courier New"/>
@@ -2885,6 +2954,9 @@
             </w:tcMar>
           </w:tcPr>
           <w:p>
+            <w:pPr>
+              <w:keepNext/>
+            </w:pPr>
             <w:r>
               <w:rPr>
                 <w:rFonts w:ascii="Times New Roman" w:cs="Times New Roman" w:eastAsia="Times New Roman" w:hAnsi="Times New Roman"/>
@@ -2920,6 +2992,9 @@
             </w:tcMar>
           </w:tcPr>
           <w:p>
+            <w:pPr>
+              <w:keepNext/>
+            </w:pPr>
             <w:r>
               <w:rPr>
                 <w:rFonts w:ascii="Courier New" w:cs="Courier New" w:eastAsia="Courier New" w:hAnsi="Courier New"/>
@@ -2949,6 +3024,9 @@
             </w:tcMar>
           </w:tcPr>
           <w:p>
+            <w:pPr>
+              <w:keepNext/>
+            </w:pPr>
             <w:r>
               <w:rPr>
                 <w:rFonts w:ascii="Times New Roman" w:cs="Times New Roman" w:eastAsia="Times New Roman" w:hAnsi="Times New Roman"/>
@@ -2984,6 +3062,9 @@
             </w:tcMar>
           </w:tcPr>
           <w:p>
+            <w:pPr>
+              <w:keepNext/>
+            </w:pPr>
             <w:r>
               <w:rPr>
                 <w:rFonts w:ascii="Courier New" w:cs="Courier New" w:eastAsia="Courier New" w:hAnsi="Courier New"/>
@@ -3013,6 +3094,9 @@
             </w:tcMar>
           </w:tcPr>
           <w:p>
+            <w:pPr>
+              <w:keepNext/>
+            </w:pPr>
             <w:r>
               <w:rPr>
                 <w:rFonts w:ascii="Times New Roman" w:cs="Times New Roman" w:eastAsia="Times New Roman" w:hAnsi="Times New Roman"/>
@@ -3048,6 +3132,9 @@
             </w:tcMar>
           </w:tcPr>
           <w:p>
+            <w:pPr>
+              <w:keepNext/>
+            </w:pPr>
             <w:r>
               <w:rPr>
                 <w:rFonts w:ascii="Courier New" w:cs="Courier New" w:eastAsia="Courier New" w:hAnsi="Courier New"/>
@@ -3077,6 +3164,9 @@
             </w:tcMar>
           </w:tcPr>
           <w:p>
+            <w:pPr>
+              <w:keepNext/>
+            </w:pPr>
             <w:r>
               <w:rPr>
                 <w:rFonts w:ascii="Times New Roman" w:cs="Times New Roman" w:eastAsia="Times New Roman" w:hAnsi="Times New Roman"/>
@@ -3089,6 +3179,9 @@
             </w:r>
           </w:p>
           <w:p>
+            <w:pPr>
+              <w:keepNext/>
+            </w:pPr>
             <w:r>
               <w:rPr>
                 <w:rFonts w:ascii="Times New Roman" w:cs="Times New Roman" w:eastAsia="Times New Roman" w:hAnsi="Times New Roman"/>
@@ -3124,6 +3217,9 @@
             </w:tcMar>
           </w:tcPr>
           <w:p>
+            <w:pPr>
+              <w:keepNext/>
+            </w:pPr>
             <w:r>
               <w:rPr>
                 <w:rFonts w:ascii="Courier New" w:cs="Courier New" w:eastAsia="Courier New" w:hAnsi="Courier New"/>
@@ -3153,6 +3249,9 @@
             </w:tcMar>
           </w:tcPr>
           <w:p>
+            <w:pPr>
+              <w:keepNext/>
+            </w:pPr>
             <w:r>
               <w:rPr>
                 <w:rFonts w:ascii="Times New Roman" w:cs="Times New Roman" w:eastAsia="Times New Roman" w:hAnsi="Times New Roman"/>
@@ -3165,6 +3264,9 @@
             </w:r>
           </w:p>
           <w:p>
+            <w:pPr>
+              <w:keepNext/>
+            </w:pPr>
             <w:r>
               <w:rPr>
                 <w:rFonts w:ascii="Times New Roman" w:cs="Times New Roman" w:eastAsia="Times New Roman" w:hAnsi="Times New Roman"/>
@@ -3200,6 +3302,9 @@
             </w:tcMar>
           </w:tcPr>
           <w:p>
+            <w:pPr>
+              <w:keepNext/>
+            </w:pPr>
             <w:r>
               <w:rPr>
                 <w:rFonts w:ascii="Courier New" w:cs="Courier New" w:eastAsia="Courier New" w:hAnsi="Courier New"/>
@@ -3229,6 +3334,9 @@
             </w:tcMar>
           </w:tcPr>
           <w:p>
+            <w:pPr>
+              <w:keepNext/>
+            </w:pPr>
             <w:r>
               <w:rPr>
                 <w:rFonts w:ascii="Times New Roman" w:cs="Times New Roman" w:eastAsia="Times New Roman" w:hAnsi="Times New Roman"/>
@@ -3241,6 +3349,9 @@
             </w:r>
           </w:p>
           <w:p>
+            <w:pPr>
+              <w:keepNext/>
+            </w:pPr>
             <w:r>
               <w:rPr>
                 <w:rFonts w:ascii="Times New Roman" w:cs="Times New Roman" w:eastAsia="Times New Roman" w:hAnsi="Times New Roman"/>
@@ -3253,6 +3364,9 @@
             </w:r>
           </w:p>
           <w:p>
+            <w:pPr>
+              <w:keepNext/>
+            </w:pPr>
             <w:r>
               <w:rPr>
                 <w:rFonts w:ascii="Times New Roman" w:cs="Times New Roman" w:eastAsia="Times New Roman" w:hAnsi="Times New Roman"/>
@@ -3288,6 +3402,9 @@
             </w:tcMar>
           </w:tcPr>
           <w:p>
+            <w:pPr>
+              <w:keepNext/>
+            </w:pPr>
             <w:r>
               <w:rPr>
                 <w:rFonts w:ascii="Courier New" w:cs="Courier New" w:eastAsia="Courier New" w:hAnsi="Courier New"/>
@@ -3317,6 +3434,9 @@
             </w:tcMar>
           </w:tcPr>
           <w:p>
+            <w:pPr>
+              <w:keepNext/>
+            </w:pPr>
             <w:r>
               <w:rPr>
                 <w:rFonts w:ascii="Times New Roman" w:cs="Times New Roman" w:eastAsia="Times New Roman" w:hAnsi="Times New Roman"/>
@@ -3329,6 +3449,9 @@
             </w:r>
           </w:p>
           <w:p>
+            <w:pPr>
+              <w:keepNext/>
+            </w:pPr>
             <w:r>
               <w:rPr>
                 <w:rFonts w:ascii="Times New Roman" w:cs="Times New Roman" w:eastAsia="Times New Roman" w:hAnsi="Times New Roman"/>
@@ -3364,6 +3487,9 @@
             </w:tcMar>
           </w:tcPr>
           <w:p>
+            <w:pPr>
+              <w:keepNext/>
+            </w:pPr>
             <w:r>
               <w:rPr>
                 <w:rFonts w:ascii="Courier New" w:cs="Courier New" w:eastAsia="Courier New" w:hAnsi="Courier New"/>
@@ -3393,6 +3519,9 @@
             </w:tcMar>
           </w:tcPr>
           <w:p>
+            <w:pPr>
+              <w:keepNext/>
+            </w:pPr>
             <w:r>
               <w:rPr>
                 <w:rFonts w:ascii="Times New Roman" w:cs="Times New Roman" w:eastAsia="Times New Roman" w:hAnsi="Times New Roman"/>
@@ -3405,6 +3534,9 @@
             </w:r>
           </w:p>
           <w:p>
+            <w:pPr>
+              <w:keepNext/>
+            </w:pPr>
             <w:r>
               <w:rPr>
                 <w:rFonts w:ascii="Times New Roman" w:cs="Times New Roman" w:eastAsia="Times New Roman" w:hAnsi="Times New Roman"/>
@@ -3417,6 +3549,9 @@
             </w:r>
           </w:p>
           <w:p>
+            <w:pPr>
+              <w:keepNext/>
+            </w:pPr>
             <w:r>
               <w:rPr>
                 <w:rFonts w:ascii="Times New Roman" w:cs="Times New Roman" w:eastAsia="Times New Roman" w:hAnsi="Times New Roman"/>
@@ -3452,6 +3587,9 @@
             </w:tcMar>
           </w:tcPr>
           <w:p>
+            <w:pPr>
+              <w:keepNext/>
+            </w:pPr>
             <w:r>
               <w:rPr>
                 <w:rFonts w:ascii="Courier New" w:cs="Courier New" w:eastAsia="Courier New" w:hAnsi="Courier New"/>
@@ -3481,6 +3619,9 @@
             </w:tcMar>
           </w:tcPr>
           <w:p>
+            <w:pPr>
+              <w:keepNext/>
+            </w:pPr>
             <w:r>
               <w:rPr>
                 <w:rFonts w:ascii="Times New Roman" w:cs="Times New Roman" w:eastAsia="Times New Roman" w:hAnsi="Times New Roman"/>
@@ -3516,6 +3657,9 @@
             </w:tcMar>
           </w:tcPr>
           <w:p>
+            <w:pPr>
+              <w:keepNext/>
+            </w:pPr>
             <w:r>
               <w:rPr>
                 <w:rFonts w:ascii="Courier New" w:cs="Courier New" w:eastAsia="Courier New" w:hAnsi="Courier New"/>
@@ -3545,6 +3689,9 @@
             </w:tcMar>
           </w:tcPr>
           <w:p>
+            <w:pPr>
+              <w:keepNext/>
+            </w:pPr>
             <w:r>
               <w:rPr>
                 <w:rFonts w:ascii="Times New Roman" w:cs="Times New Roman" w:eastAsia="Times New Roman" w:hAnsi="Times New Roman"/>
@@ -3580,6 +3727,9 @@
             </w:tcMar>
           </w:tcPr>
           <w:p>
+            <w:pPr>
+              <w:keepNext/>
+            </w:pPr>
             <w:r>
               <w:rPr>
                 <w:rFonts w:ascii="Courier New" w:cs="Courier New" w:eastAsia="Courier New" w:hAnsi="Courier New"/>
@@ -3609,6 +3759,9 @@
             </w:tcMar>
           </w:tcPr>
           <w:p>
+            <w:pPr>
+              <w:keepNext/>
+            </w:pPr>
             <w:r>
               <w:rPr>
                 <w:rFonts w:ascii="Times New Roman" w:cs="Times New Roman" w:eastAsia="Times New Roman" w:hAnsi="Times New Roman"/>
@@ -3621,6 +3774,9 @@
             </w:r>
           </w:p>
           <w:p>
+            <w:pPr>
+              <w:keepNext/>
+            </w:pPr>
             <w:r>
               <w:rPr>
                 <w:rFonts w:ascii="Times New Roman" w:cs="Times New Roman" w:eastAsia="Times New Roman" w:hAnsi="Times New Roman"/>
@@ -3656,6 +3812,9 @@
             </w:tcMar>
           </w:tcPr>
           <w:p>
+            <w:pPr>
+              <w:keepNext/>
+            </w:pPr>
             <w:r>
               <w:rPr>
                 <w:rFonts w:ascii="Courier New" w:cs="Courier New" w:eastAsia="Courier New" w:hAnsi="Courier New"/>
@@ -3685,6 +3844,9 @@
             </w:tcMar>
           </w:tcPr>
           <w:p>
+            <w:pPr>
+              <w:keepNext/>
+            </w:pPr>
             <w:r>
               <w:rPr>
                 <w:rFonts w:ascii="Times New Roman" w:cs="Times New Roman" w:eastAsia="Times New Roman" w:hAnsi="Times New Roman"/>
@@ -3697,6 +3859,9 @@
             </w:r>
           </w:p>
           <w:p>
+            <w:pPr>
+              <w:keepNext/>
+            </w:pPr>
             <w:r>
               <w:rPr>
                 <w:rFonts w:ascii="Times New Roman" w:cs="Times New Roman" w:eastAsia="Times New Roman" w:hAnsi="Times New Roman"/>
@@ -3732,6 +3897,9 @@
             </w:tcMar>
           </w:tcPr>
           <w:p>
+            <w:pPr>
+              <w:keepNext/>
+            </w:pPr>
             <w:r>
               <w:rPr>
                 <w:rFonts w:ascii="Courier New" w:cs="Courier New" w:eastAsia="Courier New" w:hAnsi="Courier New"/>
@@ -3761,6 +3929,9 @@
             </w:tcMar>
           </w:tcPr>
           <w:p>
+            <w:pPr>
+              <w:keepNext/>
+            </w:pPr>
             <w:r>
               <w:rPr>
                 <w:rFonts w:ascii="Times New Roman" w:cs="Times New Roman" w:eastAsia="Times New Roman" w:hAnsi="Times New Roman"/>
@@ -3796,6 +3967,9 @@
             </w:tcMar>
           </w:tcPr>
           <w:p>
+            <w:pPr>
+              <w:keepNext/>
+            </w:pPr>
             <w:r>
               <w:rPr>
                 <w:rFonts w:ascii="Courier New" w:cs="Courier New" w:eastAsia="Courier New" w:hAnsi="Courier New"/>
@@ -3825,6 +3999,9 @@
             </w:tcMar>
           </w:tcPr>
           <w:p>
+            <w:pPr>
+              <w:keepNext/>
+            </w:pPr>
             <w:r>
               <w:rPr>
                 <w:rFonts w:ascii="Times New Roman" w:cs="Times New Roman" w:eastAsia="Times New Roman" w:hAnsi="Times New Roman"/>
@@ -3837,6 +4014,9 @@
             </w:r>
           </w:p>
           <w:p>
+            <w:pPr>
+              <w:keepNext/>
+            </w:pPr>
             <w:r>
               <w:rPr>
                 <w:rFonts w:ascii="Times New Roman" w:cs="Times New Roman" w:eastAsia="Times New Roman" w:hAnsi="Times New Roman"/>
@@ -3872,6 +4052,9 @@
             </w:tcMar>
           </w:tcPr>
           <w:p>
+            <w:pPr>
+              <w:keepNext/>
+            </w:pPr>
             <w:r>
               <w:rPr>
                 <w:rFonts w:ascii="Courier New" w:cs="Courier New" w:eastAsia="Courier New" w:hAnsi="Courier New"/>
@@ -3901,6 +4084,9 @@
             </w:tcMar>
           </w:tcPr>
           <w:p>
+            <w:pPr>
+              <w:keepNext/>
+            </w:pPr>
             <w:r>
               <w:rPr>
                 <w:rFonts w:ascii="Times New Roman" w:cs="Times New Roman" w:eastAsia="Times New Roman" w:hAnsi="Times New Roman"/>
@@ -3936,6 +4122,9 @@
             </w:tcMar>
           </w:tcPr>
           <w:p>
+            <w:pPr>
+              <w:keepNext/>
+            </w:pPr>
             <w:r>
               <w:rPr>
                 <w:rFonts w:ascii="Courier New" w:cs="Courier New" w:eastAsia="Courier New" w:hAnsi="Courier New"/>
@@ -3965,6 +4154,9 @@
             </w:tcMar>
           </w:tcPr>
           <w:p>
+            <w:pPr>
+              <w:keepNext/>
+            </w:pPr>
             <w:r>
               <w:rPr>
                 <w:rFonts w:ascii="Times New Roman" w:cs="Times New Roman" w:eastAsia="Times New Roman" w:hAnsi="Times New Roman"/>
@@ -4000,6 +4192,9 @@
             </w:tcMar>
           </w:tcPr>
           <w:p>
+            <w:pPr>
+              <w:keepNext/>
+            </w:pPr>
             <w:r>
               <w:rPr>
                 <w:rFonts w:ascii="Courier New" w:cs="Courier New" w:eastAsia="Courier New" w:hAnsi="Courier New"/>
@@ -4029,6 +4224,9 @@
             </w:tcMar>
           </w:tcPr>
           <w:p>
+            <w:pPr>
+              <w:keepNext/>
+            </w:pPr>
             <w:r>
               <w:rPr>
                 <w:rFonts w:ascii="Times New Roman" w:cs="Times New Roman" w:eastAsia="Times New Roman" w:hAnsi="Times New Roman"/>
@@ -4064,6 +4262,9 @@
             </w:tcMar>
           </w:tcPr>
           <w:p>
+            <w:pPr>
+              <w:keepNext/>
+            </w:pPr>
             <w:r>
               <w:rPr>
                 <w:rFonts w:ascii="Courier New" w:cs="Courier New" w:eastAsia="Courier New" w:hAnsi="Courier New"/>
@@ -4093,6 +4294,9 @@
             </w:tcMar>
           </w:tcPr>
           <w:p>
+            <w:pPr>
+              <w:keepNext/>
+            </w:pPr>
             <w:r>
               <w:rPr>
                 <w:rFonts w:ascii="Times New Roman" w:cs="Times New Roman" w:eastAsia="Times New Roman" w:hAnsi="Times New Roman"/>
@@ -4128,6 +4332,9 @@
             </w:tcMar>
           </w:tcPr>
           <w:p>
+            <w:pPr>
+              <w:keepNext/>
+            </w:pPr>
             <w:r>
               <w:rPr>
                 <w:rFonts w:ascii="Courier New" w:cs="Courier New" w:eastAsia="Courier New" w:hAnsi="Courier New"/>
@@ -4157,6 +4364,9 @@
             </w:tcMar>
           </w:tcPr>
           <w:p>
+            <w:pPr>
+              <w:keepNext/>
+            </w:pPr>
             <w:r>
               <w:rPr>
                 <w:rFonts w:ascii="Times New Roman" w:cs="Times New Roman" w:eastAsia="Times New Roman" w:hAnsi="Times New Roman"/>
@@ -4418,6 +4628,9 @@
             </w:tcMar>
           </w:tcPr>
           <w:p>
+            <w:pPr>
+              <w:keepNext/>
+            </w:pPr>
             <w:r>
               <w:rPr>
                 <w:rFonts w:ascii="Times New Roman" w:cs="Times New Roman" w:eastAsia="Times New Roman" w:hAnsi="Times New Roman"/>
@@ -4449,6 +4662,9 @@
             </w:tcMar>
           </w:tcPr>
           <w:p>
+            <w:pPr>
+              <w:keepNext/>
+            </w:pPr>
             <w:r>
               <w:rPr>
                 <w:rFonts w:ascii="Times New Roman" w:cs="Times New Roman" w:eastAsia="Times New Roman" w:hAnsi="Times New Roman"/>
@@ -4480,6 +4696,9 @@
             </w:tcMar>
           </w:tcPr>
           <w:p>
+            <w:pPr>
+              <w:keepNext/>
+            </w:pPr>
             <w:r>
               <w:rPr>
                 <w:rFonts w:ascii="Times New Roman" w:cs="Times New Roman" w:eastAsia="Times New Roman" w:hAnsi="Times New Roman"/>
@@ -4516,6 +4735,9 @@
             </w:tcMar>
           </w:tcPr>
           <w:p>
+            <w:pPr>
+              <w:keepNext/>
+            </w:pPr>
             <w:r>
               <w:rPr>
                 <w:rFonts w:ascii="Times New Roman" w:cs="Times New Roman" w:eastAsia="Times New Roman" w:hAnsi="Times New Roman"/>
@@ -4545,6 +4767,9 @@
             </w:tcMar>
           </w:tcPr>
           <w:p>
+            <w:pPr>
+              <w:keepNext/>
+            </w:pPr>
             <w:r>
               <w:rPr>
                 <w:rFonts w:ascii="Times New Roman" w:cs="Times New Roman" w:eastAsia="Times New Roman" w:hAnsi="Times New Roman"/>
@@ -4574,6 +4799,9 @@
             </w:tcMar>
           </w:tcPr>
           <w:p>
+            <w:pPr>
+              <w:keepNext/>
+            </w:pPr>
             <w:r>
               <w:rPr>
                 <w:rFonts w:ascii="Courier New" w:cs="Courier New" w:eastAsia="Courier New" w:hAnsi="Courier New"/>
@@ -4609,6 +4837,9 @@
             </w:tcMar>
           </w:tcPr>
           <w:p>
+            <w:pPr>
+              <w:keepNext/>
+            </w:pPr>
             <w:r>
               <w:rPr>
                 <w:rFonts w:ascii="Times New Roman" w:cs="Times New Roman" w:eastAsia="Times New Roman" w:hAnsi="Times New Roman"/>
@@ -4638,6 +4869,9 @@
             </w:tcMar>
           </w:tcPr>
           <w:p>
+            <w:pPr>
+              <w:keepNext/>
+            </w:pPr>
             <w:r>
               <w:rPr>
                 <w:rFonts w:ascii="Times New Roman" w:cs="Times New Roman" w:eastAsia="Times New Roman" w:hAnsi="Times New Roman"/>
@@ -4667,6 +4901,9 @@
             </w:tcMar>
           </w:tcPr>
           <w:p>
+            <w:pPr>
+              <w:keepNext/>
+            </w:pPr>
             <w:r>
               <w:rPr>
                 <w:rFonts w:ascii="Courier New" w:cs="Courier New" w:eastAsia="Courier New" w:hAnsi="Courier New"/>
@@ -4702,6 +4939,9 @@
             </w:tcMar>
           </w:tcPr>
           <w:p>
+            <w:pPr>
+              <w:keepNext/>
+            </w:pPr>
             <w:r>
               <w:rPr>
                 <w:rFonts w:ascii="Times New Roman" w:cs="Times New Roman" w:eastAsia="Times New Roman" w:hAnsi="Times New Roman"/>
@@ -4731,6 +4971,9 @@
             </w:tcMar>
           </w:tcPr>
           <w:p>
+            <w:pPr>
+              <w:keepNext/>
+            </w:pPr>
             <w:r>
               <w:rPr>
                 <w:rFonts w:ascii="Times New Roman" w:cs="Times New Roman" w:eastAsia="Times New Roman" w:hAnsi="Times New Roman"/>
@@ -4760,6 +5003,9 @@
             </w:tcMar>
           </w:tcPr>
           <w:p>
+            <w:pPr>
+              <w:keepNext/>
+            </w:pPr>
             <w:r>
               <w:rPr>
                 <w:rFonts w:ascii="Courier New" w:cs="Courier New" w:eastAsia="Courier New" w:hAnsi="Courier New"/>
@@ -4795,6 +5041,9 @@
             </w:tcMar>
           </w:tcPr>
           <w:p>
+            <w:pPr>
+              <w:keepNext/>
+            </w:pPr>
             <w:r>
               <w:rPr>
                 <w:rFonts w:ascii="Times New Roman" w:cs="Times New Roman" w:eastAsia="Times New Roman" w:hAnsi="Times New Roman"/>
@@ -4824,6 +5073,9 @@
             </w:tcMar>
           </w:tcPr>
           <w:p>
+            <w:pPr>
+              <w:keepNext/>
+            </w:pPr>
             <w:r>
               <w:rPr>
                 <w:rFonts w:ascii="Times New Roman" w:cs="Times New Roman" w:eastAsia="Times New Roman" w:hAnsi="Times New Roman"/>
@@ -4853,6 +5105,9 @@
             </w:tcMar>
           </w:tcPr>
           <w:p>
+            <w:pPr>
+              <w:keepNext/>
+            </w:pPr>
             <w:r>
               <w:rPr>
                 <w:rFonts w:ascii="Courier New" w:cs="Courier New" w:eastAsia="Courier New" w:hAnsi="Courier New"/>
@@ -4888,6 +5143,9 @@
             </w:tcMar>
           </w:tcPr>
           <w:p>
+            <w:pPr>
+              <w:keepNext/>
+            </w:pPr>
             <w:r>
               <w:rPr>
                 <w:rFonts w:ascii="Times New Roman" w:cs="Times New Roman" w:eastAsia="Times New Roman" w:hAnsi="Times New Roman"/>
@@ -4917,6 +5175,9 @@
             </w:tcMar>
           </w:tcPr>
           <w:p>
+            <w:pPr>
+              <w:keepNext/>
+            </w:pPr>
             <w:r>
               <w:rPr>
                 <w:rFonts w:ascii="Times New Roman" w:cs="Times New Roman" w:eastAsia="Times New Roman" w:hAnsi="Times New Roman"/>
@@ -4946,6 +5207,9 @@
             </w:tcMar>
           </w:tcPr>
           <w:p>
+            <w:pPr>
+              <w:keepNext/>
+            </w:pPr>
             <w:r>
               <w:rPr>
                 <w:rFonts w:ascii="Courier New" w:cs="Courier New" w:eastAsia="Courier New" w:hAnsi="Courier New"/>
@@ -4954,7 +5218,7 @@
                 <w:sz w:val="18"/>
                 <w:szCs w:val="18"/>
               </w:rPr>
-              <w:t xml:space="preserve">symtab_insert</w:t>
+              <w:t xml:space="preserve">symtab_insert, print_symbols</w:t>
             </w:r>
           </w:p>
         </w:tc>
@@ -4981,6 +5245,9 @@
             </w:tcMar>
           </w:tcPr>
           <w:p>
+            <w:pPr>
+              <w:keepNext/>
+            </w:pPr>
             <w:r>
               <w:rPr>
                 <w:rFonts w:ascii="Times New Roman" w:cs="Times New Roman" w:eastAsia="Times New Roman" w:hAnsi="Times New Roman"/>
@@ -5010,6 +5277,9 @@
             </w:tcMar>
           </w:tcPr>
           <w:p>
+            <w:pPr>
+              <w:keepNext/>
+            </w:pPr>
             <w:r>
               <w:rPr>
                 <w:rFonts w:ascii="Times New Roman" w:cs="Times New Roman" w:eastAsia="Times New Roman" w:hAnsi="Times New Roman"/>
@@ -5039,6 +5309,9 @@
             </w:tcMar>
           </w:tcPr>
           <w:p>
+            <w:pPr>
+              <w:keepNext/>
+            </w:pPr>
             <w:r>
               <w:rPr>
                 <w:rFonts w:ascii="Courier New" w:cs="Courier New" w:eastAsia="Courier New" w:hAnsi="Courier New"/>
@@ -6507,7 +6780,23 @@
           <w:sz w:val="24"/>
           <w:szCs w:val="24"/>
         </w:rPr>
-        <w:t xml:space="preserve"> form. All errors stop compilation with a non-zero exit status and print no code.</w:t>
+        <w:t xml:space="preserve"> form. Line numbers come from Bison location tracking: the lexer records the line of every token, so a </w:t>
+      </w:r>
+      <w:r>
+        <w:rPr>
+          <w:rFonts w:ascii="Courier New" w:cs="Courier New" w:eastAsia="Courier New" w:hAnsi="Courier New"/>
+          <w:sz w:val="21"/>
+          <w:szCs w:val="21"/>
+        </w:rPr>
+        <w:t xml:space="preserve">break</w:t>
+      </w:r>
+      <w:r>
+        <w:rPr>
+          <w:rFonts w:ascii="Times New Roman" w:cs="Times New Roman" w:eastAsia="Times New Roman" w:hAnsi="Times New Roman"/>
+          <w:sz w:val="24"/>
+          <w:szCs w:val="24"/>
+        </w:rPr>
+        <w:t xml:space="preserve"> is reported on its own line even when its semicolon is on the next, and the symbol table records the exact line of every name. All errors stop compilation with a non-zero exit status and print no code.</w:t>
       </w:r>
     </w:p>
     <w:p>
@@ -6618,7 +6907,23 @@
           <w:sz w:val="24"/>
           <w:szCs w:val="24"/>
         </w:rPr>
-        <w:t xml:space="preserve"> reports the number of quadruples, the peak number of unfilled jumps and the number of patch-list entries allocated. The trace is implemented inside </w:t>
+        <w:t xml:space="preserve"> reports the number of quadruples, the peak number of unfilled jumps and the number of patch-list entries allocated. </w:t>
+      </w:r>
+      <w:r>
+        <w:rPr>
+          <w:rFonts w:ascii="Courier New" w:cs="Courier New" w:eastAsia="Courier New" w:hAnsi="Courier New"/>
+          <w:sz w:val="21"/>
+          <w:szCs w:val="21"/>
+        </w:rPr>
+        <w:t xml:space="preserve">--symbols</w:t>
+      </w:r>
+      <w:r>
+        <w:rPr>
+          <w:rFonts w:ascii="Times New Roman" w:cs="Times New Roman" w:eastAsia="Times New Roman" w:hAnsi="Times New Roman"/>
+          <w:sz w:val="24"/>
+          <w:szCs w:val="24"/>
+        </w:rPr>
+        <w:t xml:space="preserve"> prints the symbol table: each name with the line where it first appears. The trace is implemented inside </w:t>
       </w:r>
       <w:r>
         <w:rPr>
@@ -7219,7 +7524,7 @@
           <w:sz w:val="24"/>
           <w:szCs w:val="24"/>
         </w:rPr>
-        <w:t xml:space="preserve">The suite has 17 test programs. The 15 without options are run through both </w:t>
+        <w:t xml:space="preserve">The suite has 19 test programs. The 16 without options are run through both </w:t>
       </w:r>
       <w:r>
         <w:rPr>
@@ -7251,7 +7556,7 @@
           <w:sz w:val="24"/>
           <w:szCs w:val="24"/>
         </w:rPr>
-        <w:t xml:space="preserve">, giving 32 checks; all 32 pass. Each expected output was checked by hand against the translation scheme before it was recorded.</w:t>
+        <w:t xml:space="preserve">, giving 35 checks; all 35 pass. Each expected output was checked by hand against the translation scheme before it was recorded.</w:t>
       </w:r>
     </w:p>
     <w:tbl>
@@ -7295,6 +7600,9 @@
             </w:tcMar>
           </w:tcPr>
           <w:p>
+            <w:pPr>
+              <w:keepNext/>
+            </w:pPr>
             <w:r>
               <w:rPr>
                 <w:rFonts w:ascii="Times New Roman" w:cs="Times New Roman" w:eastAsia="Times New Roman" w:hAnsi="Times New Roman"/>
@@ -7326,6 +7634,9 @@
             </w:tcMar>
           </w:tcPr>
           <w:p>
+            <w:pPr>
+              <w:keepNext/>
+            </w:pPr>
             <w:r>
               <w:rPr>
                 <w:rFonts w:ascii="Times New Roman" w:cs="Times New Roman" w:eastAsia="Times New Roman" w:hAnsi="Times New Roman"/>
@@ -7357,6 +7668,9 @@
             </w:tcMar>
           </w:tcPr>
           <w:p>
+            <w:pPr>
+              <w:keepNext/>
+            </w:pPr>
             <w:r>
               <w:rPr>
                 <w:rFonts w:ascii="Times New Roman" w:cs="Times New Roman" w:eastAsia="Times New Roman" w:hAnsi="Times New Roman"/>
@@ -7393,6 +7707,9 @@
             </w:tcMar>
           </w:tcPr>
           <w:p>
+            <w:pPr>
+              <w:keepNext/>
+            </w:pPr>
             <w:r>
               <w:rPr>
                 <w:rFonts w:ascii="Courier New" w:cs="Courier New" w:eastAsia="Courier New" w:hAnsi="Courier New"/>
@@ -7422,6 +7739,9 @@
             </w:tcMar>
           </w:tcPr>
           <w:p>
+            <w:pPr>
+              <w:keepNext/>
+            </w:pPr>
             <w:r>
               <w:rPr>
                 <w:rFonts w:ascii="Times New Roman" w:cs="Times New Roman" w:eastAsia="Times New Roman" w:hAnsi="Times New Roman"/>
@@ -7451,6 +7771,9 @@
             </w:tcMar>
           </w:tcPr>
           <w:p>
+            <w:pPr>
+              <w:keepNext/>
+            </w:pPr>
             <w:r>
               <w:rPr>
                 <w:rFonts w:ascii="Times New Roman" w:cs="Times New Roman" w:eastAsia="Times New Roman" w:hAnsi="Times New Roman"/>
@@ -7486,6 +7809,9 @@
             </w:tcMar>
           </w:tcPr>
           <w:p>
+            <w:pPr>
+              <w:keepNext/>
+            </w:pPr>
             <w:r>
               <w:rPr>
                 <w:rFonts w:ascii="Courier New" w:cs="Courier New" w:eastAsia="Courier New" w:hAnsi="Courier New"/>
@@ -7515,6 +7841,9 @@
             </w:tcMar>
           </w:tcPr>
           <w:p>
+            <w:pPr>
+              <w:keepNext/>
+            </w:pPr>
             <w:r>
               <w:rPr>
                 <w:rFonts w:ascii="Times New Roman" w:cs="Times New Roman" w:eastAsia="Times New Roman" w:hAnsi="Times New Roman"/>
@@ -7544,6 +7873,9 @@
             </w:tcMar>
           </w:tcPr>
           <w:p>
+            <w:pPr>
+              <w:keepNext/>
+            </w:pPr>
             <w:r>
               <w:rPr>
                 <w:rFonts w:ascii="Times New Roman" w:cs="Times New Roman" w:eastAsia="Times New Roman" w:hAnsi="Times New Roman"/>
@@ -7579,6 +7911,9 @@
             </w:tcMar>
           </w:tcPr>
           <w:p>
+            <w:pPr>
+              <w:keepNext/>
+            </w:pPr>
             <w:r>
               <w:rPr>
                 <w:rFonts w:ascii="Courier New" w:cs="Courier New" w:eastAsia="Courier New" w:hAnsi="Courier New"/>
@@ -7608,6 +7943,9 @@
             </w:tcMar>
           </w:tcPr>
           <w:p>
+            <w:pPr>
+              <w:keepNext/>
+            </w:pPr>
             <w:r>
               <w:rPr>
                 <w:rFonts w:ascii="Times New Roman" w:cs="Times New Roman" w:eastAsia="Times New Roman" w:hAnsi="Times New Roman"/>
@@ -7637,6 +7975,9 @@
             </w:tcMar>
           </w:tcPr>
           <w:p>
+            <w:pPr>
+              <w:keepNext/>
+            </w:pPr>
             <w:r>
               <w:rPr>
                 <w:rFonts w:ascii="Times New Roman" w:cs="Times New Roman" w:eastAsia="Times New Roman" w:hAnsi="Times New Roman"/>
@@ -7672,6 +8013,9 @@
             </w:tcMar>
           </w:tcPr>
           <w:p>
+            <w:pPr>
+              <w:keepNext/>
+            </w:pPr>
             <w:r>
               <w:rPr>
                 <w:rFonts w:ascii="Courier New" w:cs="Courier New" w:eastAsia="Courier New" w:hAnsi="Courier New"/>
@@ -7701,6 +8045,9 @@
             </w:tcMar>
           </w:tcPr>
           <w:p>
+            <w:pPr>
+              <w:keepNext/>
+            </w:pPr>
             <w:r>
               <w:rPr>
                 <w:rFonts w:ascii="Times New Roman" w:cs="Times New Roman" w:eastAsia="Times New Roman" w:hAnsi="Times New Roman"/>
@@ -7730,6 +8077,9 @@
             </w:tcMar>
           </w:tcPr>
           <w:p>
+            <w:pPr>
+              <w:keepNext/>
+            </w:pPr>
             <w:r>
               <w:rPr>
                 <w:rFonts w:ascii="Times New Roman" w:cs="Times New Roman" w:eastAsia="Times New Roman" w:hAnsi="Times New Roman"/>
@@ -7765,6 +8115,9 @@
             </w:tcMar>
           </w:tcPr>
           <w:p>
+            <w:pPr>
+              <w:keepNext/>
+            </w:pPr>
             <w:r>
               <w:rPr>
                 <w:rFonts w:ascii="Courier New" w:cs="Courier New" w:eastAsia="Courier New" w:hAnsi="Courier New"/>
@@ -7794,6 +8147,9 @@
             </w:tcMar>
           </w:tcPr>
           <w:p>
+            <w:pPr>
+              <w:keepNext/>
+            </w:pPr>
             <w:r>
               <w:rPr>
                 <w:rFonts w:ascii="Times New Roman" w:cs="Times New Roman" w:eastAsia="Times New Roman" w:hAnsi="Times New Roman"/>
@@ -7823,6 +8179,9 @@
             </w:tcMar>
           </w:tcPr>
           <w:p>
+            <w:pPr>
+              <w:keepNext/>
+            </w:pPr>
             <w:r>
               <w:rPr>
                 <w:rFonts w:ascii="Times New Roman" w:cs="Times New Roman" w:eastAsia="Times New Roman" w:hAnsi="Times New Roman"/>
@@ -7858,6 +8217,9 @@
             </w:tcMar>
           </w:tcPr>
           <w:p>
+            <w:pPr>
+              <w:keepNext/>
+            </w:pPr>
             <w:r>
               <w:rPr>
                 <w:rFonts w:ascii="Courier New" w:cs="Courier New" w:eastAsia="Courier New" w:hAnsi="Courier New"/>
@@ -7887,6 +8249,9 @@
             </w:tcMar>
           </w:tcPr>
           <w:p>
+            <w:pPr>
+              <w:keepNext/>
+            </w:pPr>
             <w:r>
               <w:rPr>
                 <w:rFonts w:ascii="Times New Roman" w:cs="Times New Roman" w:eastAsia="Times New Roman" w:hAnsi="Times New Roman"/>
@@ -7916,6 +8281,9 @@
             </w:tcMar>
           </w:tcPr>
           <w:p>
+            <w:pPr>
+              <w:keepNext/>
+            </w:pPr>
             <w:r>
               <w:rPr>
                 <w:rFonts w:ascii="Times New Roman" w:cs="Times New Roman" w:eastAsia="Times New Roman" w:hAnsi="Times New Roman"/>
@@ -7951,6 +8319,9 @@
             </w:tcMar>
           </w:tcPr>
           <w:p>
+            <w:pPr>
+              <w:keepNext/>
+            </w:pPr>
             <w:r>
               <w:rPr>
                 <w:rFonts w:ascii="Courier New" w:cs="Courier New" w:eastAsia="Courier New" w:hAnsi="Courier New"/>
@@ -7980,6 +8351,9 @@
             </w:tcMar>
           </w:tcPr>
           <w:p>
+            <w:pPr>
+              <w:keepNext/>
+            </w:pPr>
             <w:r>
               <w:rPr>
                 <w:rFonts w:ascii="Times New Roman" w:cs="Times New Roman" w:eastAsia="Times New Roman" w:hAnsi="Times New Roman"/>
@@ -8009,6 +8383,9 @@
             </w:tcMar>
           </w:tcPr>
           <w:p>
+            <w:pPr>
+              <w:keepNext/>
+            </w:pPr>
             <w:r>
               <w:rPr>
                 <w:rFonts w:ascii="Times New Roman" w:cs="Times New Roman" w:eastAsia="Times New Roman" w:hAnsi="Times New Roman"/>
@@ -8044,6 +8421,9 @@
             </w:tcMar>
           </w:tcPr>
           <w:p>
+            <w:pPr>
+              <w:keepNext/>
+            </w:pPr>
             <w:r>
               <w:rPr>
                 <w:rFonts w:ascii="Courier New" w:cs="Courier New" w:eastAsia="Courier New" w:hAnsi="Courier New"/>
@@ -8073,6 +8453,9 @@
             </w:tcMar>
           </w:tcPr>
           <w:p>
+            <w:pPr>
+              <w:keepNext/>
+            </w:pPr>
             <w:r>
               <w:rPr>
                 <w:rFonts w:ascii="Times New Roman" w:cs="Times New Roman" w:eastAsia="Times New Roman" w:hAnsi="Times New Roman"/>
@@ -8102,6 +8485,9 @@
             </w:tcMar>
           </w:tcPr>
           <w:p>
+            <w:pPr>
+              <w:keepNext/>
+            </w:pPr>
             <w:r>
               <w:rPr>
                 <w:rFonts w:ascii="Times New Roman" w:cs="Times New Roman" w:eastAsia="Times New Roman" w:hAnsi="Times New Roman"/>
@@ -8137,6 +8523,9 @@
             </w:tcMar>
           </w:tcPr>
           <w:p>
+            <w:pPr>
+              <w:keepNext/>
+            </w:pPr>
             <w:r>
               <w:rPr>
                 <w:rFonts w:ascii="Courier New" w:cs="Courier New" w:eastAsia="Courier New" w:hAnsi="Courier New"/>
@@ -8166,6 +8555,9 @@
             </w:tcMar>
           </w:tcPr>
           <w:p>
+            <w:pPr>
+              <w:keepNext/>
+            </w:pPr>
             <w:r>
               <w:rPr>
                 <w:rFonts w:ascii="Times New Roman" w:cs="Times New Roman" w:eastAsia="Times New Roman" w:hAnsi="Times New Roman"/>
@@ -8195,6 +8587,9 @@
             </w:tcMar>
           </w:tcPr>
           <w:p>
+            <w:pPr>
+              <w:keepNext/>
+            </w:pPr>
             <w:r>
               <w:rPr>
                 <w:rFonts w:ascii="Times New Roman" w:cs="Times New Roman" w:eastAsia="Times New Roman" w:hAnsi="Times New Roman"/>
@@ -8230,6 +8625,9 @@
             </w:tcMar>
           </w:tcPr>
           <w:p>
+            <w:pPr>
+              <w:keepNext/>
+            </w:pPr>
             <w:r>
               <w:rPr>
                 <w:rFonts w:ascii="Courier New" w:cs="Courier New" w:eastAsia="Courier New" w:hAnsi="Courier New"/>
@@ -8259,6 +8657,9 @@
             </w:tcMar>
           </w:tcPr>
           <w:p>
+            <w:pPr>
+              <w:keepNext/>
+            </w:pPr>
             <w:r>
               <w:rPr>
                 <w:rFonts w:ascii="Times New Roman" w:cs="Times New Roman" w:eastAsia="Times New Roman" w:hAnsi="Times New Roman"/>
@@ -8288,6 +8689,9 @@
             </w:tcMar>
           </w:tcPr>
           <w:p>
+            <w:pPr>
+              <w:keepNext/>
+            </w:pPr>
             <w:r>
               <w:rPr>
                 <w:rFonts w:ascii="Times New Roman" w:cs="Times New Roman" w:eastAsia="Times New Roman" w:hAnsi="Times New Roman"/>
@@ -8323,6 +8727,9 @@
             </w:tcMar>
           </w:tcPr>
           <w:p>
+            <w:pPr>
+              <w:keepNext/>
+            </w:pPr>
             <w:r>
               <w:rPr>
                 <w:rFonts w:ascii="Courier New" w:cs="Courier New" w:eastAsia="Courier New" w:hAnsi="Courier New"/>
@@ -8352,6 +8759,9 @@
             </w:tcMar>
           </w:tcPr>
           <w:p>
+            <w:pPr>
+              <w:keepNext/>
+            </w:pPr>
             <w:r>
               <w:rPr>
                 <w:rFonts w:ascii="Times New Roman" w:cs="Times New Roman" w:eastAsia="Times New Roman" w:hAnsi="Times New Roman"/>
@@ -8381,6 +8791,9 @@
             </w:tcMar>
           </w:tcPr>
           <w:p>
+            <w:pPr>
+              <w:keepNext/>
+            </w:pPr>
             <w:r>
               <w:rPr>
                 <w:rFonts w:ascii="Times New Roman" w:cs="Times New Roman" w:eastAsia="Times New Roman" w:hAnsi="Times New Roman"/>
@@ -8416,6 +8829,9 @@
             </w:tcMar>
           </w:tcPr>
           <w:p>
+            <w:pPr>
+              <w:keepNext/>
+            </w:pPr>
             <w:r>
               <w:rPr>
                 <w:rFonts w:ascii="Courier New" w:cs="Courier New" w:eastAsia="Courier New" w:hAnsi="Courier New"/>
@@ -8445,6 +8861,9 @@
             </w:tcMar>
           </w:tcPr>
           <w:p>
+            <w:pPr>
+              <w:keepNext/>
+            </w:pPr>
             <w:r>
               <w:rPr>
                 <w:rFonts w:ascii="Times New Roman" w:cs="Times New Roman" w:eastAsia="Times New Roman" w:hAnsi="Times New Roman"/>
@@ -8474,6 +8893,9 @@
             </w:tcMar>
           </w:tcPr>
           <w:p>
+            <w:pPr>
+              <w:keepNext/>
+            </w:pPr>
             <w:r>
               <w:rPr>
                 <w:rFonts w:ascii="Times New Roman" w:cs="Times New Roman" w:eastAsia="Times New Roman" w:hAnsi="Times New Roman"/>
@@ -8509,6 +8931,9 @@
             </w:tcMar>
           </w:tcPr>
           <w:p>
+            <w:pPr>
+              <w:keepNext/>
+            </w:pPr>
             <w:r>
               <w:rPr>
                 <w:rFonts w:ascii="Courier New" w:cs="Courier New" w:eastAsia="Courier New" w:hAnsi="Courier New"/>
@@ -8538,6 +8963,9 @@
             </w:tcMar>
           </w:tcPr>
           <w:p>
+            <w:pPr>
+              <w:keepNext/>
+            </w:pPr>
             <w:r>
               <w:rPr>
                 <w:rFonts w:ascii="Times New Roman" w:cs="Times New Roman" w:eastAsia="Times New Roman" w:hAnsi="Times New Roman"/>
@@ -8567,6 +8995,9 @@
             </w:tcMar>
           </w:tcPr>
           <w:p>
+            <w:pPr>
+              <w:keepNext/>
+            </w:pPr>
             <w:r>
               <w:rPr>
                 <w:rFonts w:ascii="Times New Roman" w:cs="Times New Roman" w:eastAsia="Times New Roman" w:hAnsi="Times New Roman"/>
@@ -8602,6 +9033,9 @@
             </w:tcMar>
           </w:tcPr>
           <w:p>
+            <w:pPr>
+              <w:keepNext/>
+            </w:pPr>
             <w:r>
               <w:rPr>
                 <w:rFonts w:ascii="Courier New" w:cs="Courier New" w:eastAsia="Courier New" w:hAnsi="Courier New"/>
@@ -8631,6 +9065,9 @@
             </w:tcMar>
           </w:tcPr>
           <w:p>
+            <w:pPr>
+              <w:keepNext/>
+            </w:pPr>
             <w:r>
               <w:rPr>
                 <w:rFonts w:ascii="Times New Roman" w:cs="Times New Roman" w:eastAsia="Times New Roman" w:hAnsi="Times New Roman"/>
@@ -8660,6 +9097,9 @@
             </w:tcMar>
           </w:tcPr>
           <w:p>
+            <w:pPr>
+              <w:keepNext/>
+            </w:pPr>
             <w:r>
               <w:rPr>
                 <w:rFonts w:ascii="Times New Roman" w:cs="Times New Roman" w:eastAsia="Times New Roman" w:hAnsi="Times New Roman"/>
@@ -8695,6 +9135,9 @@
             </w:tcMar>
           </w:tcPr>
           <w:p>
+            <w:pPr>
+              <w:keepNext/>
+            </w:pPr>
             <w:r>
               <w:rPr>
                 <w:rFonts w:ascii="Courier New" w:cs="Courier New" w:eastAsia="Courier New" w:hAnsi="Courier New"/>
@@ -8724,6 +9167,9 @@
             </w:tcMar>
           </w:tcPr>
           <w:p>
+            <w:pPr>
+              <w:keepNext/>
+            </w:pPr>
             <w:r>
               <w:rPr>
                 <w:rFonts w:ascii="Times New Roman" w:cs="Times New Roman" w:eastAsia="Times New Roman" w:hAnsi="Times New Roman"/>
@@ -8753,6 +9199,9 @@
             </w:tcMar>
           </w:tcPr>
           <w:p>
+            <w:pPr>
+              <w:keepNext/>
+            </w:pPr>
             <w:r>
               <w:rPr>
                 <w:rFonts w:ascii="Times New Roman" w:cs="Times New Roman" w:eastAsia="Times New Roman" w:hAnsi="Times New Roman"/>
@@ -8788,6 +9237,9 @@
             </w:tcMar>
           </w:tcPr>
           <w:p>
+            <w:pPr>
+              <w:keepNext/>
+            </w:pPr>
             <w:r>
               <w:rPr>
                 <w:rFonts w:ascii="Courier New" w:cs="Courier New" w:eastAsia="Courier New" w:hAnsi="Courier New"/>
@@ -8817,6 +9269,9 @@
             </w:tcMar>
           </w:tcPr>
           <w:p>
+            <w:pPr>
+              <w:keepNext/>
+            </w:pPr>
             <w:r>
               <w:rPr>
                 <w:rFonts w:ascii="Times New Roman" w:cs="Times New Roman" w:eastAsia="Times New Roman" w:hAnsi="Times New Roman"/>
@@ -8846,6 +9301,9 @@
             </w:tcMar>
           </w:tcPr>
           <w:p>
+            <w:pPr>
+              <w:keepNext/>
+            </w:pPr>
             <w:r>
               <w:rPr>
                 <w:rFonts w:ascii="Times New Roman" w:cs="Times New Roman" w:eastAsia="Times New Roman" w:hAnsi="Times New Roman"/>
@@ -8881,6 +9339,9 @@
             </w:tcMar>
           </w:tcPr>
           <w:p>
+            <w:pPr>
+              <w:keepNext/>
+            </w:pPr>
             <w:r>
               <w:rPr>
                 <w:rFonts w:ascii="Courier New" w:cs="Courier New" w:eastAsia="Courier New" w:hAnsi="Courier New"/>
@@ -8910,6 +9371,9 @@
             </w:tcMar>
           </w:tcPr>
           <w:p>
+            <w:pPr>
+              <w:keepNext/>
+            </w:pPr>
             <w:r>
               <w:rPr>
                 <w:rFonts w:ascii="Times New Roman" w:cs="Times New Roman" w:eastAsia="Times New Roman" w:hAnsi="Times New Roman"/>
@@ -8939,6 +9403,213 @@
             </w:tcMar>
           </w:tcPr>
           <w:p>
+            <w:pPr>
+              <w:keepNext/>
+            </w:pPr>
+            <w:r>
+              <w:rPr>
+                <w:rFonts w:ascii="Times New Roman" w:cs="Times New Roman" w:eastAsia="Times New Roman" w:hAnsi="Times New Roman"/>
+                <w:b w:val="false"/>
+                <w:bCs w:val="false"/>
+                <w:sz w:val="20"/>
+                <w:szCs w:val="20"/>
+              </w:rPr>
+              <w:t xml:space="preserve">Pass</w:t>
+            </w:r>
+          </w:p>
+        </w:tc>
+      </w:tr>
+      <w:tr>
+        <w:trPr>
+          <w:cantSplit/>
+          <w:tblHeader w:val="false"/>
+        </w:trPr>
+        <w:tc>
+          <w:tcPr>
+            <w:tcW w:type="dxa" w:w="2600"/>
+            <w:tcBorders>
+              <w:top w:val="single" w:color="9AA5B1" w:sz="4"/>
+              <w:left w:val="single" w:color="9AA5B1" w:sz="4"/>
+              <w:bottom w:val="single" w:color="9AA5B1" w:sz="4"/>
+              <w:right w:val="single" w:color="9AA5B1" w:sz="4"/>
+            </w:tcBorders>
+            <w:tcMar>
+              <w:top w:type="dxa" w:w="60"/>
+              <w:left w:type="dxa" w:w="100"/>
+              <w:bottom w:type="dxa" w:w="60"/>
+              <w:right w:type="dxa" w:w="100"/>
+            </w:tcMar>
+          </w:tcPr>
+          <w:p>
+            <w:pPr>
+              <w:keepNext/>
+            </w:pPr>
+            <w:r>
+              <w:rPr>
+                <w:rFonts w:ascii="Courier New" w:cs="Courier New" w:eastAsia="Courier New" w:hAnsi="Courier New"/>
+                <w:b w:val="false"/>
+                <w:bCs w:val="false"/>
+                <w:sz w:val="18"/>
+                <w:szCs w:val="18"/>
+              </w:rPr>
+              <w:t xml:space="preserve">18_symbols</w:t>
+            </w:r>
+          </w:p>
+        </w:tc>
+        <w:tc>
+          <w:tcPr>
+            <w:tcW w:type="dxa" w:w="5226"/>
+            <w:tcBorders>
+              <w:top w:val="single" w:color="9AA5B1" w:sz="4"/>
+              <w:left w:val="single" w:color="9AA5B1" w:sz="4"/>
+              <w:bottom w:val="single" w:color="9AA5B1" w:sz="4"/>
+              <w:right w:val="single" w:color="9AA5B1" w:sz="4"/>
+            </w:tcBorders>
+            <w:tcMar>
+              <w:top w:type="dxa" w:w="60"/>
+              <w:left w:type="dxa" w:w="100"/>
+              <w:bottom w:type="dxa" w:w="60"/>
+              <w:right w:type="dxa" w:w="100"/>
+            </w:tcMar>
+          </w:tcPr>
+          <w:p>
+            <w:pPr>
+              <w:keepNext/>
+            </w:pPr>
+            <w:r>
+              <w:rPr>
+                <w:rFonts w:ascii="Times New Roman" w:cs="Times New Roman" w:eastAsia="Times New Roman" w:hAnsi="Times New Roman"/>
+                <w:b w:val="false"/>
+                <w:bCs w:val="false"/>
+                <w:sz w:val="20"/>
+                <w:szCs w:val="20"/>
+              </w:rPr>
+              <w:t xml:space="preserve">--symbols table, names on later lines of a statement</w:t>
+            </w:r>
+          </w:p>
+        </w:tc>
+        <w:tc>
+          <w:tcPr>
+            <w:tcW w:type="dxa" w:w="1200"/>
+            <w:tcBorders>
+              <w:top w:val="single" w:color="9AA5B1" w:sz="4"/>
+              <w:left w:val="single" w:color="9AA5B1" w:sz="4"/>
+              <w:bottom w:val="single" w:color="9AA5B1" w:sz="4"/>
+              <w:right w:val="single" w:color="9AA5B1" w:sz="4"/>
+            </w:tcBorders>
+            <w:tcMar>
+              <w:top w:type="dxa" w:w="60"/>
+              <w:left w:type="dxa" w:w="100"/>
+              <w:bottom w:type="dxa" w:w="60"/>
+              <w:right w:type="dxa" w:w="100"/>
+            </w:tcMar>
+          </w:tcPr>
+          <w:p>
+            <w:pPr>
+              <w:keepNext/>
+            </w:pPr>
+            <w:r>
+              <w:rPr>
+                <w:rFonts w:ascii="Times New Roman" w:cs="Times New Roman" w:eastAsia="Times New Roman" w:hAnsi="Times New Roman"/>
+                <w:b w:val="false"/>
+                <w:bCs w:val="false"/>
+                <w:sz w:val="20"/>
+                <w:szCs w:val="20"/>
+              </w:rPr>
+              <w:t xml:space="preserve">Pass</w:t>
+            </w:r>
+          </w:p>
+        </w:tc>
+      </w:tr>
+      <w:tr>
+        <w:trPr>
+          <w:cantSplit/>
+          <w:tblHeader w:val="false"/>
+        </w:trPr>
+        <w:tc>
+          <w:tcPr>
+            <w:tcW w:type="dxa" w:w="2600"/>
+            <w:tcBorders>
+              <w:top w:val="single" w:color="9AA5B1" w:sz="4"/>
+              <w:left w:val="single" w:color="9AA5B1" w:sz="4"/>
+              <w:bottom w:val="single" w:color="9AA5B1" w:sz="4"/>
+              <w:right w:val="single" w:color="9AA5B1" w:sz="4"/>
+            </w:tcBorders>
+            <w:tcMar>
+              <w:top w:type="dxa" w:w="60"/>
+              <w:left w:type="dxa" w:w="100"/>
+              <w:bottom w:type="dxa" w:w="60"/>
+              <w:right w:type="dxa" w:w="100"/>
+            </w:tcMar>
+          </w:tcPr>
+          <w:p>
+            <w:pPr>
+              <w:keepNext/>
+            </w:pPr>
+            <w:r>
+              <w:rPr>
+                <w:rFonts w:ascii="Courier New" w:cs="Courier New" w:eastAsia="Courier New" w:hAnsi="Courier New"/>
+                <w:b w:val="false"/>
+                <w:bCs w:val="false"/>
+                <w:sz w:val="18"/>
+                <w:szCs w:val="18"/>
+              </w:rPr>
+              <w:t xml:space="preserve">19_error_line</w:t>
+            </w:r>
+          </w:p>
+        </w:tc>
+        <w:tc>
+          <w:tcPr>
+            <w:tcW w:type="dxa" w:w="5226"/>
+            <w:tcBorders>
+              <w:top w:val="single" w:color="9AA5B1" w:sz="4"/>
+              <w:left w:val="single" w:color="9AA5B1" w:sz="4"/>
+              <w:bottom w:val="single" w:color="9AA5B1" w:sz="4"/>
+              <w:right w:val="single" w:color="9AA5B1" w:sz="4"/>
+            </w:tcBorders>
+            <w:tcMar>
+              <w:top w:type="dxa" w:w="60"/>
+              <w:left w:type="dxa" w:w="100"/>
+              <w:bottom w:type="dxa" w:w="60"/>
+              <w:right w:type="dxa" w:w="100"/>
+            </w:tcMar>
+          </w:tcPr>
+          <w:p>
+            <w:pPr>
+              <w:keepNext/>
+            </w:pPr>
+            <w:r>
+              <w:rPr>
+                <w:rFonts w:ascii="Times New Roman" w:cs="Times New Roman" w:eastAsia="Times New Roman" w:hAnsi="Times New Roman"/>
+                <w:b w:val="false"/>
+                <w:bCs w:val="false"/>
+                <w:sz w:val="20"/>
+                <w:szCs w:val="20"/>
+              </w:rPr>
+              <w:t xml:space="preserve">break and its semicolon on different lines</w:t>
+            </w:r>
+          </w:p>
+        </w:tc>
+        <w:tc>
+          <w:tcPr>
+            <w:tcW w:type="dxa" w:w="1200"/>
+            <w:tcBorders>
+              <w:top w:val="single" w:color="9AA5B1" w:sz="4"/>
+              <w:left w:val="single" w:color="9AA5B1" w:sz="4"/>
+              <w:bottom w:val="single" w:color="9AA5B1" w:sz="4"/>
+              <w:right w:val="single" w:color="9AA5B1" w:sz="4"/>
+            </w:tcBorders>
+            <w:tcMar>
+              <w:top w:type="dxa" w:w="60"/>
+              <w:left w:type="dxa" w:w="100"/>
+              <w:bottom w:type="dxa" w:w="60"/>
+              <w:right w:type="dxa" w:w="100"/>
+            </w:tcMar>
+          </w:tcPr>
+          <w:p>
+            <w:pPr>
+              <w:keepNext/>
+            </w:pPr>
             <w:r>
               <w:rPr>
                 <w:rFonts w:ascii="Times New Roman" w:cs="Times New Roman" w:eastAsia="Times New Roman" w:hAnsi="Times New Roman"/>
@@ -8966,7 +9637,7 @@
           <w:sz w:val="20"/>
           <w:szCs w:val="20"/>
         </w:rPr>
-        <w:t xml:space="preserve">Table 5.1  Test programs (tests 01-15 also pass through twopass)</w:t>
+        <w:t xml:space="preserve">Table 5.1  Test programs (all but 16-18 also pass through twopass)</w:t>
       </w:r>
     </w:p>
     <w:p>
@@ -10237,6 +10908,9 @@
             </w:tcMar>
           </w:tcPr>
           <w:p>
+            <w:pPr>
+              <w:keepNext/>
+            </w:pPr>
             <w:r>
               <w:rPr>
                 <w:rFonts w:ascii="Times New Roman" w:cs="Times New Roman" w:eastAsia="Times New Roman" w:hAnsi="Times New Roman"/>
@@ -10268,6 +10942,9 @@
             </w:tcMar>
           </w:tcPr>
           <w:p>
+            <w:pPr>
+              <w:keepNext/>
+            </w:pPr>
             <w:r>
               <w:rPr>
                 <w:rFonts w:ascii="Times New Roman" w:cs="Times New Roman" w:eastAsia="Times New Roman" w:hAnsi="Times New Roman"/>
@@ -10299,6 +10976,9 @@
             </w:tcMar>
           </w:tcPr>
           <w:p>
+            <w:pPr>
+              <w:keepNext/>
+            </w:pPr>
             <w:r>
               <w:rPr>
                 <w:rFonts w:ascii="Times New Roman" w:cs="Times New Roman" w:eastAsia="Times New Roman" w:hAnsi="Times New Roman"/>
@@ -10330,6 +11010,9 @@
             </w:tcMar>
           </w:tcPr>
           <w:p>
+            <w:pPr>
+              <w:keepNext/>
+            </w:pPr>
             <w:r>
               <w:rPr>
                 <w:rFonts w:ascii="Times New Roman" w:cs="Times New Roman" w:eastAsia="Times New Roman" w:hAnsi="Times New Roman"/>
@@ -10361,6 +11044,9 @@
             </w:tcMar>
           </w:tcPr>
           <w:p>
+            <w:pPr>
+              <w:keepNext/>
+            </w:pPr>
             <w:r>
               <w:rPr>
                 <w:rFonts w:ascii="Times New Roman" w:cs="Times New Roman" w:eastAsia="Times New Roman" w:hAnsi="Times New Roman"/>
@@ -10392,6 +11078,9 @@
             </w:tcMar>
           </w:tcPr>
           <w:p>
+            <w:pPr>
+              <w:keepNext/>
+            </w:pPr>
             <w:r>
               <w:rPr>
                 <w:rFonts w:ascii="Times New Roman" w:cs="Times New Roman" w:eastAsia="Times New Roman" w:hAnsi="Times New Roman"/>
@@ -10428,6 +11117,9 @@
             </w:tcMar>
           </w:tcPr>
           <w:p>
+            <w:pPr>
+              <w:keepNext/>
+            </w:pPr>
             <w:r>
               <w:rPr>
                 <w:rFonts w:ascii="Courier New" w:cs="Courier New" w:eastAsia="Courier New" w:hAnsi="Courier New"/>
@@ -10457,6 +11149,9 @@
             </w:tcMar>
           </w:tcPr>
           <w:p>
+            <w:pPr>
+              <w:keepNext/>
+            </w:pPr>
             <w:r>
               <w:rPr>
                 <w:rFonts w:ascii="Times New Roman" w:cs="Times New Roman" w:eastAsia="Times New Roman" w:hAnsi="Times New Roman"/>
@@ -10486,6 +11181,9 @@
             </w:tcMar>
           </w:tcPr>
           <w:p>
+            <w:pPr>
+              <w:keepNext/>
+            </w:pPr>
             <w:r>
               <w:rPr>
                 <w:rFonts w:ascii="Times New Roman" w:cs="Times New Roman" w:eastAsia="Times New Roman" w:hAnsi="Times New Roman"/>
@@ -10515,6 +11213,9 @@
             </w:tcMar>
           </w:tcPr>
           <w:p>
+            <w:pPr>
+              <w:keepNext/>
+            </w:pPr>
             <w:r>
               <w:rPr>
                 <w:rFonts w:ascii="Times New Roman" w:cs="Times New Roman" w:eastAsia="Times New Roman" w:hAnsi="Times New Roman"/>
@@ -10544,6 +11245,9 @@
             </w:tcMar>
           </w:tcPr>
           <w:p>
+            <w:pPr>
+              <w:keepNext/>
+            </w:pPr>
             <w:r>
               <w:rPr>
                 <w:rFonts w:ascii="Times New Roman" w:cs="Times New Roman" w:eastAsia="Times New Roman" w:hAnsi="Times New Roman"/>
@@ -10573,6 +11277,9 @@
             </w:tcMar>
           </w:tcPr>
           <w:p>
+            <w:pPr>
+              <w:keepNext/>
+            </w:pPr>
             <w:r>
               <w:rPr>
                 <w:rFonts w:ascii="Times New Roman" w:cs="Times New Roman" w:eastAsia="Times New Roman" w:hAnsi="Times New Roman"/>
@@ -10608,6 +11315,9 @@
             </w:tcMar>
           </w:tcPr>
           <w:p>
+            <w:pPr>
+              <w:keepNext/>
+            </w:pPr>
             <w:r>
               <w:rPr>
                 <w:rFonts w:ascii="Courier New" w:cs="Courier New" w:eastAsia="Courier New" w:hAnsi="Courier New"/>
@@ -10637,6 +11347,9 @@
             </w:tcMar>
           </w:tcPr>
           <w:p>
+            <w:pPr>
+              <w:keepNext/>
+            </w:pPr>
             <w:r>
               <w:rPr>
                 <w:rFonts w:ascii="Times New Roman" w:cs="Times New Roman" w:eastAsia="Times New Roman" w:hAnsi="Times New Roman"/>
@@ -10666,6 +11379,9 @@
             </w:tcMar>
           </w:tcPr>
           <w:p>
+            <w:pPr>
+              <w:keepNext/>
+            </w:pPr>
             <w:r>
               <w:rPr>
                 <w:rFonts w:ascii="Times New Roman" w:cs="Times New Roman" w:eastAsia="Times New Roman" w:hAnsi="Times New Roman"/>
@@ -10695,6 +11411,9 @@
             </w:tcMar>
           </w:tcPr>
           <w:p>
+            <w:pPr>
+              <w:keepNext/>
+            </w:pPr>
             <w:r>
               <w:rPr>
                 <w:rFonts w:ascii="Times New Roman" w:cs="Times New Roman" w:eastAsia="Times New Roman" w:hAnsi="Times New Roman"/>
@@ -10724,6 +11443,9 @@
             </w:tcMar>
           </w:tcPr>
           <w:p>
+            <w:pPr>
+              <w:keepNext/>
+            </w:pPr>
             <w:r>
               <w:rPr>
                 <w:rFonts w:ascii="Times New Roman" w:cs="Times New Roman" w:eastAsia="Times New Roman" w:hAnsi="Times New Roman"/>
@@ -10753,6 +11475,9 @@
             </w:tcMar>
           </w:tcPr>
           <w:p>
+            <w:pPr>
+              <w:keepNext/>
+            </w:pPr>
             <w:r>
               <w:rPr>
                 <w:rFonts w:ascii="Times New Roman" w:cs="Times New Roman" w:eastAsia="Times New Roman" w:hAnsi="Times New Roman"/>
@@ -10788,6 +11513,9 @@
             </w:tcMar>
           </w:tcPr>
           <w:p>
+            <w:pPr>
+              <w:keepNext/>
+            </w:pPr>
             <w:r>
               <w:rPr>
                 <w:rFonts w:ascii="Courier New" w:cs="Courier New" w:eastAsia="Courier New" w:hAnsi="Courier New"/>
@@ -10817,6 +11545,9 @@
             </w:tcMar>
           </w:tcPr>
           <w:p>
+            <w:pPr>
+              <w:keepNext/>
+            </w:pPr>
             <w:r>
               <w:rPr>
                 <w:rFonts w:ascii="Times New Roman" w:cs="Times New Roman" w:eastAsia="Times New Roman" w:hAnsi="Times New Roman"/>
@@ -10846,6 +11577,9 @@
             </w:tcMar>
           </w:tcPr>
           <w:p>
+            <w:pPr>
+              <w:keepNext/>
+            </w:pPr>
             <w:r>
               <w:rPr>
                 <w:rFonts w:ascii="Times New Roman" w:cs="Times New Roman" w:eastAsia="Times New Roman" w:hAnsi="Times New Roman"/>
@@ -10875,6 +11609,9 @@
             </w:tcMar>
           </w:tcPr>
           <w:p>
+            <w:pPr>
+              <w:keepNext/>
+            </w:pPr>
             <w:r>
               <w:rPr>
                 <w:rFonts w:ascii="Times New Roman" w:cs="Times New Roman" w:eastAsia="Times New Roman" w:hAnsi="Times New Roman"/>
@@ -10904,6 +11641,9 @@
             </w:tcMar>
           </w:tcPr>
           <w:p>
+            <w:pPr>
+              <w:keepNext/>
+            </w:pPr>
             <w:r>
               <w:rPr>
                 <w:rFonts w:ascii="Times New Roman" w:cs="Times New Roman" w:eastAsia="Times New Roman" w:hAnsi="Times New Roman"/>
@@ -10933,6 +11673,9 @@
             </w:tcMar>
           </w:tcPr>
           <w:p>
+            <w:pPr>
+              <w:keepNext/>
+            </w:pPr>
             <w:r>
               <w:rPr>
                 <w:rFonts w:ascii="Times New Roman" w:cs="Times New Roman" w:eastAsia="Times New Roman" w:hAnsi="Times New Roman"/>
@@ -10968,6 +11711,9 @@
             </w:tcMar>
           </w:tcPr>
           <w:p>
+            <w:pPr>
+              <w:keepNext/>
+            </w:pPr>
             <w:r>
               <w:rPr>
                 <w:rFonts w:ascii="Courier New" w:cs="Courier New" w:eastAsia="Courier New" w:hAnsi="Courier New"/>
@@ -10997,6 +11743,9 @@
             </w:tcMar>
           </w:tcPr>
           <w:p>
+            <w:pPr>
+              <w:keepNext/>
+            </w:pPr>
             <w:r>
               <w:rPr>
                 <w:rFonts w:ascii="Times New Roman" w:cs="Times New Roman" w:eastAsia="Times New Roman" w:hAnsi="Times New Roman"/>
@@ -11026,6 +11775,9 @@
             </w:tcMar>
           </w:tcPr>
           <w:p>
+            <w:pPr>
+              <w:keepNext/>
+            </w:pPr>
             <w:r>
               <w:rPr>
                 <w:rFonts w:ascii="Times New Roman" w:cs="Times New Roman" w:eastAsia="Times New Roman" w:hAnsi="Times New Roman"/>
@@ -11055,6 +11807,9 @@
             </w:tcMar>
           </w:tcPr>
           <w:p>
+            <w:pPr>
+              <w:keepNext/>
+            </w:pPr>
             <w:r>
               <w:rPr>
                 <w:rFonts w:ascii="Times New Roman" w:cs="Times New Roman" w:eastAsia="Times New Roman" w:hAnsi="Times New Roman"/>
@@ -11084,6 +11839,9 @@
             </w:tcMar>
           </w:tcPr>
           <w:p>
+            <w:pPr>
+              <w:keepNext/>
+            </w:pPr>
             <w:r>
               <w:rPr>
                 <w:rFonts w:ascii="Times New Roman" w:cs="Times New Roman" w:eastAsia="Times New Roman" w:hAnsi="Times New Roman"/>
@@ -11113,6 +11871,9 @@
             </w:tcMar>
           </w:tcPr>
           <w:p>
+            <w:pPr>
+              <w:keepNext/>
+            </w:pPr>
             <w:r>
               <w:rPr>
                 <w:rFonts w:ascii="Times New Roman" w:cs="Times New Roman" w:eastAsia="Times New Roman" w:hAnsi="Times New Roman"/>
@@ -11148,6 +11909,9 @@
             </w:tcMar>
           </w:tcPr>
           <w:p>
+            <w:pPr>
+              <w:keepNext/>
+            </w:pPr>
             <w:r>
               <w:rPr>
                 <w:rFonts w:ascii="Courier New" w:cs="Courier New" w:eastAsia="Courier New" w:hAnsi="Courier New"/>
@@ -11177,6 +11941,9 @@
             </w:tcMar>
           </w:tcPr>
           <w:p>
+            <w:pPr>
+              <w:keepNext/>
+            </w:pPr>
             <w:r>
               <w:rPr>
                 <w:rFonts w:ascii="Times New Roman" w:cs="Times New Roman" w:eastAsia="Times New Roman" w:hAnsi="Times New Roman"/>
@@ -11206,6 +11973,9 @@
             </w:tcMar>
           </w:tcPr>
           <w:p>
+            <w:pPr>
+              <w:keepNext/>
+            </w:pPr>
             <w:r>
               <w:rPr>
                 <w:rFonts w:ascii="Times New Roman" w:cs="Times New Roman" w:eastAsia="Times New Roman" w:hAnsi="Times New Roman"/>
@@ -11235,6 +12005,9 @@
             </w:tcMar>
           </w:tcPr>
           <w:p>
+            <w:pPr>
+              <w:keepNext/>
+            </w:pPr>
             <w:r>
               <w:rPr>
                 <w:rFonts w:ascii="Times New Roman" w:cs="Times New Roman" w:eastAsia="Times New Roman" w:hAnsi="Times New Roman"/>
@@ -11264,6 +12037,9 @@
             </w:tcMar>
           </w:tcPr>
           <w:p>
+            <w:pPr>
+              <w:keepNext/>
+            </w:pPr>
             <w:r>
               <w:rPr>
                 <w:rFonts w:ascii="Times New Roman" w:cs="Times New Roman" w:eastAsia="Times New Roman" w:hAnsi="Times New Roman"/>
@@ -11293,6 +12069,9 @@
             </w:tcMar>
           </w:tcPr>
           <w:p>
+            <w:pPr>
+              <w:keepNext/>
+            </w:pPr>
             <w:r>
               <w:rPr>
                 <w:rFonts w:ascii="Times New Roman" w:cs="Times New Roman" w:eastAsia="Times New Roman" w:hAnsi="Times New Roman"/>
@@ -11328,6 +12107,9 @@
             </w:tcMar>
           </w:tcPr>
           <w:p>
+            <w:pPr>
+              <w:keepNext/>
+            </w:pPr>
             <w:r>
               <w:rPr>
                 <w:rFonts w:ascii="Courier New" w:cs="Courier New" w:eastAsia="Courier New" w:hAnsi="Courier New"/>
@@ -11357,6 +12139,9 @@
             </w:tcMar>
           </w:tcPr>
           <w:p>
+            <w:pPr>
+              <w:keepNext/>
+            </w:pPr>
             <w:r>
               <w:rPr>
                 <w:rFonts w:ascii="Times New Roman" w:cs="Times New Roman" w:eastAsia="Times New Roman" w:hAnsi="Times New Roman"/>
@@ -11386,6 +12171,9 @@
             </w:tcMar>
           </w:tcPr>
           <w:p>
+            <w:pPr>
+              <w:keepNext/>
+            </w:pPr>
             <w:r>
               <w:rPr>
                 <w:rFonts w:ascii="Times New Roman" w:cs="Times New Roman" w:eastAsia="Times New Roman" w:hAnsi="Times New Roman"/>
@@ -11415,6 +12203,9 @@
             </w:tcMar>
           </w:tcPr>
           <w:p>
+            <w:pPr>
+              <w:keepNext/>
+            </w:pPr>
             <w:r>
               <w:rPr>
                 <w:rFonts w:ascii="Times New Roman" w:cs="Times New Roman" w:eastAsia="Times New Roman" w:hAnsi="Times New Roman"/>
@@ -11444,6 +12235,9 @@
             </w:tcMar>
           </w:tcPr>
           <w:p>
+            <w:pPr>
+              <w:keepNext/>
+            </w:pPr>
             <w:r>
               <w:rPr>
                 <w:rFonts w:ascii="Times New Roman" w:cs="Times New Roman" w:eastAsia="Times New Roman" w:hAnsi="Times New Roman"/>
@@ -11473,6 +12267,9 @@
             </w:tcMar>
           </w:tcPr>
           <w:p>
+            <w:pPr>
+              <w:keepNext/>
+            </w:pPr>
             <w:r>
               <w:rPr>
                 <w:rFonts w:ascii="Times New Roman" w:cs="Times New Roman" w:eastAsia="Times New Roman" w:hAnsi="Times New Roman"/>
@@ -11508,6 +12305,9 @@
             </w:tcMar>
           </w:tcPr>
           <w:p>
+            <w:pPr>
+              <w:keepNext/>
+            </w:pPr>
             <w:r>
               <w:rPr>
                 <w:rFonts w:ascii="Courier New" w:cs="Courier New" w:eastAsia="Courier New" w:hAnsi="Courier New"/>
@@ -11537,6 +12337,9 @@
             </w:tcMar>
           </w:tcPr>
           <w:p>
+            <w:pPr>
+              <w:keepNext/>
+            </w:pPr>
             <w:r>
               <w:rPr>
                 <w:rFonts w:ascii="Times New Roman" w:cs="Times New Roman" w:eastAsia="Times New Roman" w:hAnsi="Times New Roman"/>
@@ -11566,6 +12369,9 @@
             </w:tcMar>
           </w:tcPr>
           <w:p>
+            <w:pPr>
+              <w:keepNext/>
+            </w:pPr>
             <w:r>
               <w:rPr>
                 <w:rFonts w:ascii="Times New Roman" w:cs="Times New Roman" w:eastAsia="Times New Roman" w:hAnsi="Times New Roman"/>
@@ -11595,6 +12401,9 @@
             </w:tcMar>
           </w:tcPr>
           <w:p>
+            <w:pPr>
+              <w:keepNext/>
+            </w:pPr>
             <w:r>
               <w:rPr>
                 <w:rFonts w:ascii="Times New Roman" w:cs="Times New Roman" w:eastAsia="Times New Roman" w:hAnsi="Times New Roman"/>
@@ -11624,6 +12433,9 @@
             </w:tcMar>
           </w:tcPr>
           <w:p>
+            <w:pPr>
+              <w:keepNext/>
+            </w:pPr>
             <w:r>
               <w:rPr>
                 <w:rFonts w:ascii="Times New Roman" w:cs="Times New Roman" w:eastAsia="Times New Roman" w:hAnsi="Times New Roman"/>
@@ -11653,6 +12465,9 @@
             </w:tcMar>
           </w:tcPr>
           <w:p>
+            <w:pPr>
+              <w:keepNext/>
+            </w:pPr>
             <w:r>
               <w:rPr>
                 <w:rFonts w:ascii="Times New Roman" w:cs="Times New Roman" w:eastAsia="Times New Roman" w:hAnsi="Times New Roman"/>
@@ -11688,6 +12503,9 @@
             </w:tcMar>
           </w:tcPr>
           <w:p>
+            <w:pPr>
+              <w:keepNext/>
+            </w:pPr>
             <w:r>
               <w:rPr>
                 <w:rFonts w:ascii="Courier New" w:cs="Courier New" w:eastAsia="Courier New" w:hAnsi="Courier New"/>
@@ -11717,6 +12535,9 @@
             </w:tcMar>
           </w:tcPr>
           <w:p>
+            <w:pPr>
+              <w:keepNext/>
+            </w:pPr>
             <w:r>
               <w:rPr>
                 <w:rFonts w:ascii="Times New Roman" w:cs="Times New Roman" w:eastAsia="Times New Roman" w:hAnsi="Times New Roman"/>
@@ -11746,6 +12567,9 @@
             </w:tcMar>
           </w:tcPr>
           <w:p>
+            <w:pPr>
+              <w:keepNext/>
+            </w:pPr>
             <w:r>
               <w:rPr>
                 <w:rFonts w:ascii="Times New Roman" w:cs="Times New Roman" w:eastAsia="Times New Roman" w:hAnsi="Times New Roman"/>
@@ -11775,6 +12599,9 @@
             </w:tcMar>
           </w:tcPr>
           <w:p>
+            <w:pPr>
+              <w:keepNext/>
+            </w:pPr>
             <w:r>
               <w:rPr>
                 <w:rFonts w:ascii="Times New Roman" w:cs="Times New Roman" w:eastAsia="Times New Roman" w:hAnsi="Times New Roman"/>
@@ -11804,6 +12631,9 @@
             </w:tcMar>
           </w:tcPr>
           <w:p>
+            <w:pPr>
+              <w:keepNext/>
+            </w:pPr>
             <w:r>
               <w:rPr>
                 <w:rFonts w:ascii="Times New Roman" w:cs="Times New Roman" w:eastAsia="Times New Roman" w:hAnsi="Times New Roman"/>
@@ -11833,6 +12663,9 @@
             </w:tcMar>
           </w:tcPr>
           <w:p>
+            <w:pPr>
+              <w:keepNext/>
+            </w:pPr>
             <w:r>
               <w:rPr>
                 <w:rFonts w:ascii="Times New Roman" w:cs="Times New Roman" w:eastAsia="Times New Roman" w:hAnsi="Times New Roman"/>
@@ -11868,6 +12701,9 @@
             </w:tcMar>
           </w:tcPr>
           <w:p>
+            <w:pPr>
+              <w:keepNext/>
+            </w:pPr>
             <w:r>
               <w:rPr>
                 <w:rFonts w:ascii="Courier New" w:cs="Courier New" w:eastAsia="Courier New" w:hAnsi="Courier New"/>
@@ -11897,6 +12733,9 @@
             </w:tcMar>
           </w:tcPr>
           <w:p>
+            <w:pPr>
+              <w:keepNext/>
+            </w:pPr>
             <w:r>
               <w:rPr>
                 <w:rFonts w:ascii="Times New Roman" w:cs="Times New Roman" w:eastAsia="Times New Roman" w:hAnsi="Times New Roman"/>
@@ -11926,6 +12765,9 @@
             </w:tcMar>
           </w:tcPr>
           <w:p>
+            <w:pPr>
+              <w:keepNext/>
+            </w:pPr>
             <w:r>
               <w:rPr>
                 <w:rFonts w:ascii="Times New Roman" w:cs="Times New Roman" w:eastAsia="Times New Roman" w:hAnsi="Times New Roman"/>
@@ -11955,6 +12797,9 @@
             </w:tcMar>
           </w:tcPr>
           <w:p>
+            <w:pPr>
+              <w:keepNext/>
+            </w:pPr>
             <w:r>
               <w:rPr>
                 <w:rFonts w:ascii="Times New Roman" w:cs="Times New Roman" w:eastAsia="Times New Roman" w:hAnsi="Times New Roman"/>
@@ -11984,6 +12829,9 @@
             </w:tcMar>
           </w:tcPr>
           <w:p>
+            <w:pPr>
+              <w:keepNext/>
+            </w:pPr>
             <w:r>
               <w:rPr>
                 <w:rFonts w:ascii="Times New Roman" w:cs="Times New Roman" w:eastAsia="Times New Roman" w:hAnsi="Times New Roman"/>
@@ -12013,6 +12861,9 @@
             </w:tcMar>
           </w:tcPr>
           <w:p>
+            <w:pPr>
+              <w:keepNext/>
+            </w:pPr>
             <w:r>
               <w:rPr>
                 <w:rFonts w:ascii="Times New Roman" w:cs="Times New Roman" w:eastAsia="Times New Roman" w:hAnsi="Times New Roman"/>
@@ -12048,6 +12899,9 @@
             </w:tcMar>
           </w:tcPr>
           <w:p>
+            <w:pPr>
+              <w:keepNext/>
+            </w:pPr>
             <w:r>
               <w:rPr>
                 <w:rFonts w:ascii="Courier New" w:cs="Courier New" w:eastAsia="Courier New" w:hAnsi="Courier New"/>
@@ -12077,6 +12931,9 @@
             </w:tcMar>
           </w:tcPr>
           <w:p>
+            <w:pPr>
+              <w:keepNext/>
+            </w:pPr>
             <w:r>
               <w:rPr>
                 <w:rFonts w:ascii="Times New Roman" w:cs="Times New Roman" w:eastAsia="Times New Roman" w:hAnsi="Times New Roman"/>
@@ -12106,6 +12963,9 @@
             </w:tcMar>
           </w:tcPr>
           <w:p>
+            <w:pPr>
+              <w:keepNext/>
+            </w:pPr>
             <w:r>
               <w:rPr>
                 <w:rFonts w:ascii="Times New Roman" w:cs="Times New Roman" w:eastAsia="Times New Roman" w:hAnsi="Times New Roman"/>
@@ -12135,6 +12995,9 @@
             </w:tcMar>
           </w:tcPr>
           <w:p>
+            <w:pPr>
+              <w:keepNext/>
+            </w:pPr>
             <w:r>
               <w:rPr>
                 <w:rFonts w:ascii="Times New Roman" w:cs="Times New Roman" w:eastAsia="Times New Roman" w:hAnsi="Times New Roman"/>
@@ -12164,6 +13027,9 @@
             </w:tcMar>
           </w:tcPr>
           <w:p>
+            <w:pPr>
+              <w:keepNext/>
+            </w:pPr>
             <w:r>
               <w:rPr>
                 <w:rFonts w:ascii="Times New Roman" w:cs="Times New Roman" w:eastAsia="Times New Roman" w:hAnsi="Times New Roman"/>
@@ -12193,6 +13059,9 @@
             </w:tcMar>
           </w:tcPr>
           <w:p>
+            <w:pPr>
+              <w:keepNext/>
+            </w:pPr>
             <w:r>
               <w:rPr>
                 <w:rFonts w:ascii="Times New Roman" w:cs="Times New Roman" w:eastAsia="Times New Roman" w:hAnsi="Times New Roman"/>
@@ -12228,6 +13097,9 @@
             </w:tcMar>
           </w:tcPr>
           <w:p>
+            <w:pPr>
+              <w:keepNext/>
+            </w:pPr>
             <w:r>
               <w:rPr>
                 <w:rFonts w:ascii="Courier New" w:cs="Courier New" w:eastAsia="Courier New" w:hAnsi="Courier New"/>
@@ -12257,6 +13129,9 @@
             </w:tcMar>
           </w:tcPr>
           <w:p>
+            <w:pPr>
+              <w:keepNext/>
+            </w:pPr>
             <w:r>
               <w:rPr>
                 <w:rFonts w:ascii="Times New Roman" w:cs="Times New Roman" w:eastAsia="Times New Roman" w:hAnsi="Times New Roman"/>
@@ -12286,6 +13161,9 @@
             </w:tcMar>
           </w:tcPr>
           <w:p>
+            <w:pPr>
+              <w:keepNext/>
+            </w:pPr>
             <w:r>
               <w:rPr>
                 <w:rFonts w:ascii="Times New Roman" w:cs="Times New Roman" w:eastAsia="Times New Roman" w:hAnsi="Times New Roman"/>
@@ -12315,6 +13193,9 @@
             </w:tcMar>
           </w:tcPr>
           <w:p>
+            <w:pPr>
+              <w:keepNext/>
+            </w:pPr>
             <w:r>
               <w:rPr>
                 <w:rFonts w:ascii="Times New Roman" w:cs="Times New Roman" w:eastAsia="Times New Roman" w:hAnsi="Times New Roman"/>
@@ -12344,6 +13225,9 @@
             </w:tcMar>
           </w:tcPr>
           <w:p>
+            <w:pPr>
+              <w:keepNext/>
+            </w:pPr>
             <w:r>
               <w:rPr>
                 <w:rFonts w:ascii="Times New Roman" w:cs="Times New Roman" w:eastAsia="Times New Roman" w:hAnsi="Times New Roman"/>
@@ -12373,6 +13257,9 @@
             </w:tcMar>
           </w:tcPr>
           <w:p>
+            <w:pPr>
+              <w:keepNext/>
+            </w:pPr>
             <w:r>
               <w:rPr>
                 <w:rFonts w:ascii="Times New Roman" w:cs="Times New Roman" w:eastAsia="Times New Roman" w:hAnsi="Times New Roman"/>
@@ -12408,6 +13295,9 @@
             </w:tcMar>
           </w:tcPr>
           <w:p>
+            <w:pPr>
+              <w:keepNext/>
+            </w:pPr>
             <w:r>
               <w:rPr>
                 <w:rFonts w:ascii="Courier New" w:cs="Courier New" w:eastAsia="Courier New" w:hAnsi="Courier New"/>
@@ -12437,6 +13327,9 @@
             </w:tcMar>
           </w:tcPr>
           <w:p>
+            <w:pPr>
+              <w:keepNext/>
+            </w:pPr>
             <w:r>
               <w:rPr>
                 <w:rFonts w:ascii="Times New Roman" w:cs="Times New Roman" w:eastAsia="Times New Roman" w:hAnsi="Times New Roman"/>
@@ -12466,6 +13359,9 @@
             </w:tcMar>
           </w:tcPr>
           <w:p>
+            <w:pPr>
+              <w:keepNext/>
+            </w:pPr>
             <w:r>
               <w:rPr>
                 <w:rFonts w:ascii="Times New Roman" w:cs="Times New Roman" w:eastAsia="Times New Roman" w:hAnsi="Times New Roman"/>
@@ -12495,6 +13391,9 @@
             </w:tcMar>
           </w:tcPr>
           <w:p>
+            <w:pPr>
+              <w:keepNext/>
+            </w:pPr>
             <w:r>
               <w:rPr>
                 <w:rFonts w:ascii="Times New Roman" w:cs="Times New Roman" w:eastAsia="Times New Roman" w:hAnsi="Times New Roman"/>
@@ -12524,6 +13423,9 @@
             </w:tcMar>
           </w:tcPr>
           <w:p>
+            <w:pPr>
+              <w:keepNext/>
+            </w:pPr>
             <w:r>
               <w:rPr>
                 <w:rFonts w:ascii="Times New Roman" w:cs="Times New Roman" w:eastAsia="Times New Roman" w:hAnsi="Times New Roman"/>
@@ -12553,6 +13455,9 @@
             </w:tcMar>
           </w:tcPr>
           <w:p>
+            <w:pPr>
+              <w:keepNext/>
+            </w:pPr>
             <w:r>
               <w:rPr>
                 <w:rFonts w:ascii="Times New Roman" w:cs="Times New Roman" w:eastAsia="Times New Roman" w:hAnsi="Times New Roman"/>
@@ -12657,7 +13562,7 @@
           <w:sz w:val="24"/>
           <w:szCs w:val="24"/>
         </w:rPr>
-        <w:t xml:space="preserve">, into three-address code by backpatching. The grammar has no conflicts, every jump is filled, and the output agrees exactly with an independent two-pass implementation on every test and on 400 random programs. The trace and step modes make the patch lists, normally invisible, observable at every step, which serves the teaching gap identified in the survey.</w:t>
+        <w:t xml:space="preserve">, into three-address code by backpatching. The grammar has no conflicts, every jump is filled, and the output agrees exactly with an independent two-pass implementation on all 16 tests they share and on 400 random programs. The trace and step modes make the patch lists, normally invisible, observable at every step, which serves the teaching gap identified in the survey.</w:t>
       </w:r>
     </w:p>
     <w:p>
@@ -12986,7 +13891,7 @@
           <w:sz w:val="19"/>
           <w:szCs w:val="19"/>
         </w:rPr>
-        <w:t xml:space="preserve">make                                   # builds ./icg and ./twopass</w:t>
+        <w:t xml:space="preserve">make                                    # builds ./icg and ./twopass</w:t>
       </w:r>
     </w:p>
     <w:p>
@@ -13003,7 +13908,7 @@
           <w:sz w:val="19"/>
           <w:szCs w:val="19"/>
         </w:rPr>
-        <w:t xml:space="preserve">make test                              # 32 checks</w:t>
+        <w:t xml:space="preserve">make test                               # 35 checks</w:t>
       </w:r>
     </w:p>
     <w:p>
@@ -13020,7 +13925,7 @@
           <w:sz w:val="19"/>
           <w:szCs w:val="19"/>
         </w:rPr>
-        <w:t xml:space="preserve">./icg tests/04_while.src               # three-address code</w:t>
+        <w:t xml:space="preserve">./icg tests/04_while.src                # three-address code</w:t>
       </w:r>
     </w:p>
     <w:p>
@@ -13037,7 +13942,7 @@
           <w:sz w:val="19"/>
           <w:szCs w:val="19"/>
         </w:rPr>
-        <w:t xml:space="preserve">./icg --format=quad tests/04_while.src # quadruple table</w:t>
+        <w:t xml:space="preserve">./icg --format=quad tests/04_while.src  # quadruple table</w:t>
       </w:r>
     </w:p>
     <w:p>
@@ -13054,7 +13959,7 @@
           <w:sz w:val="19"/>
           <w:szCs w:val="19"/>
         </w:rPr>
-        <w:t xml:space="preserve">./icg --trace tests/03_if_else.src     # every list operation</w:t>
+        <w:t xml:space="preserve">./icg --trace tests/03_if_else.src      # every list operation</w:t>
       </w:r>
     </w:p>
     <w:p>
@@ -13071,7 +13976,7 @@
           <w:sz w:val="19"/>
           <w:szCs w:val="19"/>
         </w:rPr>
-        <w:t xml:space="preserve">./icg --step tests/03_if_else.src      # same, one step per Enter</w:t>
+        <w:t xml:space="preserve">./icg --step tests/03_if_else.src       # same, one step per Enter</w:t>
       </w:r>
     </w:p>
     <w:p>
@@ -13088,7 +13993,7 @@
           <w:sz w:val="19"/>
           <w:szCs w:val="19"/>
         </w:rPr>
-        <w:t xml:space="preserve">./icg --stats tests/06_nested.src      # code size, pending jumps</w:t>
+        <w:t xml:space="preserve">./icg --stats tests/06_nested.src       # code size, pending jumps</w:t>
       </w:r>
     </w:p>
     <w:p>
@@ -13105,7 +14010,24 @@
           <w:sz w:val="19"/>
           <w:szCs w:val="19"/>
         </w:rPr>
-        <w:t xml:space="preserve">./twopass --format=labels tests/04_while.src</w:t>
+        <w:t xml:space="preserve">./icg --symbols tests/18_symbols.src    # symbol table</w:t>
+      </w:r>
+    </w:p>
+    <w:p>
+      <w:pPr>
+        <w:keepNext/>
+        <w:keepLines/>
+        <w:shd w:fill="F2F4F7" w:color="auto" w:val="clear"/>
+        <w:spacing w:before="0" w:after="0" w:line="240"/>
+        <w:ind w:left="240" w:right="240"/>
+      </w:pPr>
+      <w:r>
+        <w:rPr>
+          <w:rFonts w:ascii="Courier New" w:cs="Courier New" w:eastAsia="Courier New" w:hAnsi="Courier New"/>
+          <w:sz w:val="19"/>
+          <w:szCs w:val="19"/>
+        </w:rPr>
+        <w:t xml:space="preserve">./twopass --format=labels tests/04_while.src  # unresolved labels</w:t>
       </w:r>
     </w:p>
     <w:p>
@@ -13122,7 +14044,7 @@
           <w:sz w:val="19"/>
           <w:szCs w:val="19"/>
         </w:rPr>
-        <w:t xml:space="preserve">./icg &lt; program.src                    # read standard input</w:t>
+        <w:t xml:space="preserve">./icg &lt; program.src                     # read standard input</w:t>
       </w:r>
     </w:p>
     <w:sectPr>

</xml_diff>